<commit_message>
Clarify Wednesday presentation scripts
</commit_message>
<xml_diff>
--- a/THESIS DOCUMENTATION/Project_FALCON_Wednesday_Presenter_Guide.docx
+++ b/THESIS DOCUMENTATION/Project_FALCON_Wednesday_Presenter_Guide.docx
@@ -228,7 +228,7 @@
       </w:r>
       <w:r>
         <w:rPr/>
-        <w:t>Good day, everyone. We are the Project FALCON Research Group from Fullbright College. FALCON means an AI-powered Live Coastal Observation Network. It is our proposed affordable and solar-powered smart buoy for collecting localized coastal information. Today, we will show the problem we want to address, how the system is designed, what we have already developed, and what support we need to build and validate the physical prototype.”</w:t>
+        <w:t>Good day, everyone. We are the Project FALCON Research Group from Fullbright College. Project FALCON is our proposed smart buoy for observing coastal conditions in one specific location. In simple terms, it is a floating device with sensors, a small computer, solar power, and a dashboard. It will collect information near the deployment site and show the data in an easier form. Today, we will explain the problem, our proposed solution, what already works in software, and what we still need to build and test.”</w:t>
       </w:r>
     </w:p>
     <w:p>
@@ -296,7 +296,7 @@
       </w:r>
       <w:r>
         <w:rPr/>
-        <w:t>Official forecasts are important, and FALCON is not intended to replace them. The gap we are studying is affordable and site-specific observation. A wide-area forecast may not describe the exact condition at one near-shore research site, port, or small-boat launch area. Professional oceanographic equipment may also be difficult for a small school or local organization to purchase and maintain. Our research question is whether a modular and local-first buoy can provide useful observations at one defined Palawan pilot site at a manageable cost and complexity.”</w:t>
+        <w:t>Why is this project needed? We already have official forecasts, and we respect them. FALCON will not replace PAGASA or any official warning system. Our concern is that a forecast for a large area may not describe the exact condition at a small near-shore site. Professional monitoring equipment can also be expensive and difficult for a school or small local organization to maintain. So our question is simple: can we build a more affordable buoy that provides useful information for one selected pilot site in Palawan?”</w:t>
       </w:r>
     </w:p>
     <w:p>
@@ -364,7 +364,7 @@
       </w:r>
       <w:r>
         <w:rPr/>
-        <w:t>FALCON works in four simple stages. First, its sensors measure buoy motion, water pressure, wind, GPS position, temperature, battery, and solar condition. Second, the ESP32 repeatedly reads the sensors, while the Orange Pi stores and processes the information and hosts the local dashboard. Third, users can view current readings, history, equipment health, and abnormal-displacement alerts. Finally, after enough real field data are collected, we will train and evaluate a short-horizon wave-height model. The prediction shown today is a research feature and simulated demonstration, not yet a validated forecast.”</w:t>
+        <w:t>Our proposed solution is a smart coastal buoy with four basic jobs. First, the sensors measure movement, water pressure, wind, location, temperature, and available power. Second, the ESP32 gathers the sensor readings, while the Orange Pi saves and processes them. The Orange Pi is simply the small onboard computer of the buoy. Third, the dashboard shows the information through numbers, graphs, history, and alerts. Fourth, after collecting enough real data, we will study whether the system can estimate wave height several minutes ahead. For now, the prediction is only a simulated research demonstration and not yet a real operational forecast.”</w:t>
       </w:r>
     </w:p>
     <w:p>
@@ -432,7 +432,7 @@
       </w:r>
       <w:r>
         <w:rPr/>
-        <w:t>This image focuses on the above-water assembly. At the top, the wind sensor, GPS, and antennas need clear exposure. Below them, the solar panels are attached to a cross-braced tower, with cables routed through protected paths. The large upper electronics pod is the dry service area for the Orange Pi, ESP32, storage, interface boards, and power monitors. The BNO085 motion sensor should be fixed to the rigid central structure so its movement represents the buoy and not a loose panel. At the bottom is the cylindrical main float, whose waterline and freeboard still need to be verified through physical testing.”</w:t>
+        <w:t>This image shows the parts above the water. At the top are the wind sensor, GPS, and antennas because they need open space to work properly. The solar panels are mounted on the tower and provide energy for the system. The large box in the middle is the upper electronics pod. Ito po ang dry and protected box where we plan to place the ESP32, Orange Pi, storage, and other electronic boards. The motion sensor is attached to a rigid part of the structure so it measures the movement of the buoy itself. The round body at the bottom is the main float that keeps the structure above water. Its final balance and waterline will still be tested using the physical prototype.”</w:t>
       </w:r>
     </w:p>
     <w:p>
@@ -500,7 +500,7 @@
       </w:r>
       <w:r>
         <w:rPr/>
-        <w:t>Each component has a specific responsibility. The BNO085 measures orientation and motion, while the Bar02 measures water pressure that may assist wave estimation after calibration. GPS provides position, the weather sensor measures wind, two INA260 boards monitor battery and solar branches, MCP9808 measures enclosure temperature, and ADS1115 reads wind direction. The ESP32 gathers these sensor readings and sends telemetry to the Orange Pi, which handles storage, processing, the API, and dashboard. The lower part shows the proposed protected path from solar charging to the battery and separate regulated supplies. This diagram is a design guide; final wiring will follow the purchased-board datasheets, measurements, fusing calculations, and approved pinout.”</w:t>
+        <w:t>This diagram explains the job of each electronic component. The BNO085 measures the tilt and movement of the buoy. The Bar02 measures water pressure, which may help us estimate wave movement after proper calibration. GPS tells us the location, while the wind sensor measures wind speed and direction. The INA260 boards check the battery and solar power, and the MCP9808 checks the temperature inside the electronics box. All sensor readings go first to the ESP32. The ESP32 then sends the data to the Orange Pi for storage, processing, and display on the dashboard. The lower section shows how solar energy charges the battery and safely supplies power to the electronics. This is still a design guide; we will confirm the exact wiring using the real boards and their official datasheets.”</w:t>
       </w:r>
     </w:p>
     <w:p>
@@ -568,7 +568,7 @@
       </w:r>
       <w:r>
         <w:rPr/>
-        <w:t>The upper box is designed as a serviceable electronics pod. A removable tray separates the Orange Pi computing area from the ESP32 and sensor-control area. Terminal blocks organize the regulated power, ground, and signal connections so technicians do not need to trace loose wires. Every external cable should pass through a labeled locking gland, include strain relief, and carry the same identifier at both ends. Power and signal wiring are separated to reduce interference. The final arrangement still requires heat, waterproofing, electromagnetic-compatibility, and maintenance-clearance tests.”</w:t>
+        <w:t>This slide shows how we plan to arrange the electronics inside the upper box. The parts will be mounted on a removable tray, so we can inspect or replace them without removing the whole buoy structure. The Orange Pi side handles computing, while the ESP32 side handles sensor reading. Terminal blocks keep the wires organized instead of leaving many loose connections. Each cable will have a label on both ends, and cables entering the box will pass through waterproof locking glands. We will also separate signal wires from power wires to reduce electrical interference. Before actual deployment, we still need to test heat, waterproofing, wire clearance, and ease of maintenance.”</w:t>
       </w:r>
     </w:p>
     <w:p>
@@ -636,7 +636,7 @@
       </w:r>
       <w:r>
         <w:rPr/>
-        <w:t>The workflow is straightforward. Sensors take measurements, and the ESP32 checks and packages them into a consistent telemetry format. A USB or validated UART connection sends the data to the Orange Pi. The Orange Pi stores the records locally, performs signal processing, evaluates alerts, serves the API, and later runs the validated prediction model. The dashboard converts these records into understandable values, graphs, history, and system-health information. Because the main workflow is local, continuous cloud access is not required.”</w:t>
+        <w:t>This slide shows the flow of information. First, the sensors take measurements. Next, the ESP32 collects and checks those readings. It sends them to the Orange Pi as telemetry, which simply means organized sensor data. The Orange Pi saves the data, performs calculations, checks possible alerts, and sends the results to the dashboard. The dashboard then presents the information as readable values, graphs, and status messages. We call this local-first because the main processing and storage happen inside the buoy system, even without a continuous internet connection.”</w:t>
       </w:r>
     </w:p>
     <w:p>
@@ -704,7 +704,7 @@
       </w:r>
       <w:r>
         <w:rPr/>
-        <w:t>FALCON is more than an illustration. We already have a responsive dashboard, ESP32 firmware foundation, telemetry specification, sensor and fault simulator, Python edge service, local database, alert logic, wiring plan, bill of materials, and technical documentation. The firmware, backend tests, and dashboard build have been checked in software. However, the values on the dashboard are simulated and are not field measurements. Physical sensor integration, calibration, marine testing, and field-trained AI remain the next development stage.”</w:t>
+        <w:t>What have we finished so far? We already created the responsive dashboard, the basic ESP32 firmware, the data format used by the system, the simulator, the Orange Pi or laptop edge service, the local database, alerts, wiring plans, bill of materials, and project documentation. We also tested whether the firmware, backend service, and dashboard can build and operate in software. However, we want to be honest: the current dashboard data are simulated. They do not yet come from a complete buoy in the sea. Our next stage is to connect the real sensors, calibrate them, build the buoy, and perform supervised field testing.”</w:t>
       </w:r>
     </w:p>
     <w:p>
@@ -772,7 +772,7 @@
       </w:r>
       <w:r>
         <w:rPr/>
-        <w:t>Our innovation claim is responsible system integration, not the invention of every component. FALCON combines affordable and replaceable hardware, local data collection, edge computing, solar-energy monitoring, a human-readable dashboard, and a prediction research workflow. It is local-first, so essential monitoring and storage are not dependent on a cloud connection. The interface also separates measured, simulated, estimated, and predicted information so users are not misled. The research contribution will be the documented and validated integration of these parts for one defined local coastal use case.”</w:t>
+        <w:t>We are not claiming that we invented the buoy, the sensors, or artificial intelligence. These technologies already exist. Our proposed innovation is how we combine them into one affordable and maintainable system for a specific local use. FALCON joins sensors, local processing, solar-power monitoring, data storage, a dashboard, and a future prediction model. It also clearly labels whether information is measured, simulated, estimated, or predicted. Our contribution will be proven only if the complete system is calibrated and tested for one selected coastal site.”</w:t>
       </w:r>
     </w:p>
     <w:p>
@@ -840,7 +840,7 @@
       </w:r>
       <w:r>
         <w:rPr/>
-        <w:t>Possible beneficiaries include a coastal LGU or DRRM office, fisherfolk and small-craft users, schools and researchers, and later ports, tourism groups, or environmental organizations. But we will not claim that one prototype immediately serves all of them. Our first step is to confirm one primary partner, one accessible Palawan pilot site, and one realistic information need. This keeps the research measurable and prevents the project from becoming too broad. If the first pilot demonstrates value, the system can later be adapted or expanded.”</w:t>
+        <w:t>Several groups may benefit from this project. A coastal LGU or DRRM office may use the observation history and equipment alerts. Fisherfolk or small-boat users may benefit from easier access to information about one nearby site. Schools and researchers may use the platform and collected dataset for future studies. However, we will not claim that one prototype can immediately serve everyone. We will first choose one partner, one pilot location in Palawan, and one specific information need. If the first pilot is useful, the project can be improved and expanded later.”</w:t>
       </w:r>
     </w:p>
     <w:p>
@@ -908,7 +908,7 @@
       </w:r>
       <w:r>
         <w:rPr/>
-        <w:t>We estimate eight to twelve months for development. We will first finalize component choices, mechanical details, safety requirements, and procurement. Next, we will integrate the electronics, fabricate and seal the buoy, and calibrate every sensor under controlled conditions. Only after passing those checks will we conduct a supervised near-shore pilot. The collected data will then be used to compare simple prediction baselines with a lightweight model. The final stage is evaluation and documentation, including limitations and recommendations.”</w:t>
+        <w:t>Our estimated development time is eight to twelve months. First, we will finalize the design, exact components, safety requirements, and purchasing plan. Second, we will assemble the electronics and fabricate the buoy enclosure and structure. Third, we will calibrate the sensors and test power, waterproofing, and communication in controlled conditions. After those tests pass, we will conduct a supervised near-shore pilot. We will use the collected data to compare our AI model with a baseline, meaning a simple prediction method used as a reference. Finally, we will report the results, errors, limitations, and recommended improvements.”</w:t>
       </w:r>
     </w:p>
     <w:p>
@@ -976,7 +976,7 @@
       </w:r>
       <w:r>
         <w:rPr/>
-        <w:t>Our preliminary development estimate ranges from seventy-two thousand to one hundred twenty-seven thousand pesos. This covers sensors and controllers, the Orange Pi, solar and battery power, the marine structure and enclosure, mooring and safety materials, calibration, supervised field work, spare parts, transport, and contingency. The range represents the complete prototype-development process, not only the visible electronics. It is still a planning estimate and will be replaced by current supplier quotations and approved specifications before procurement. Any final spending will be documented through a bill of materials and test records.”</w:t>
+        <w:t>Our preliminary budget is around seventy-two thousand to one hundred twenty-seven thousand pesos. Why is it a range? Because the exact marine-rated parts, fabrication cost, and supplier prices still need final quotations. The budget includes not only sensors and computers, but also solar power, battery, waterproof enclosure, buoy structure, mooring, safety materials, calibration, field testing, transportation, spare parts, and contingency. In other words, the request covers the complete process of building and testing a safe prototype. Before purchasing, we will submit an updated bill of materials with actual supplier prices.”</w:t>
       </w:r>
     </w:p>
     <w:p>
@@ -1044,7 +1044,7 @@
       </w:r>
       <w:r>
         <w:rPr/>
-        <w:t>At the end of funded development, we aim to deliver one integrated physical prototype, calibrated sensors and power system, a working local dashboard and data archive, supervised coastal-test results, and a comparison between the prediction model and a simple baseline. We will also provide reproducible technical documentation so the design, results, and limitations can be reviewed. We are requesting support for component procurement, fabrication, calibration access, supervised field testing, and technical mentorship. We are not asking you to accept an untested forecast. We are asking for the opportunity to build the prototype and generate credible local evidence. Thank you, and we are ready for your questions.”</w:t>
+        <w:t>If the project receives support, our goal is to produce one complete and documented physical prototype. We will deliver calibrated sensor results, tested solar and battery operation, a working local dashboard, stored coastal data, and supervised pilot-test findings. We will also compare the future AI model with a simple baseline to determine whether AI actually improves the prediction. We are requesting support for the components, fabrication, calibration, field testing, and technical guidance. To be clear, we are not asking you to trust an untested forecast. We are asking for the opportunity to build the system properly and collect evidence that will show whether it works. Thank you, and we are ready for your questions.”</w:t>
       </w:r>
     </w:p>
     <w:p>

</xml_diff>

<commit_message>
Add plain-language Falcon component explanations
</commit_message>
<xml_diff>
--- a/THESIS DOCUMENTATION/Project_FALCON_Wednesday_Presenter_Guide.docx
+++ b/THESIS DOCUMENTATION/Project_FALCON_Wednesday_Presenter_Guide.docx
@@ -177,9 +177,1965 @@
       </w:pPr>
       <w:r>
         <w:rPr/>
-        <w:t>Slide-by-Slide Script</w:t>
-      </w:r>
-    </w:p>
+        <w:t>Simple Component Guide</w:t>
+      </w:r>
+    </w:p>
+    <w:p>
+      <w:pPr>
+        <w:pStyle w:val="BodyTextbox"/>
+        <w:pBdr>
+          <w:left w:val="single" w:sz="24" w:space="10" w:color="3F879E"/>
+        </w:pBdr>
+        <w:bidi w:val="0"/>
+        <w:spacing w:before="180" w:after="180"/>
+        <w:ind w:start="180" w:end="180"/>
+        <w:rPr/>
+      </w:pPr>
+      <w:r>
+        <w:rPr>
+          <w:rStyle w:val="Strong"/>
+        </w:rPr>
+        <w:t>Easy way to explain the hardware:</w:t>
+      </w:r>
+      <w:r>
+        <w:rPr/>
+        <w:t xml:space="preserve"> Do not begin with model numbers. First say the component's simple job, then mention its name. Example: “This sensor measures the tilt and movement of the buoy. It is called the BNO085.”</w:t>
+      </w:r>
+    </w:p>
+    <w:tbl>
+      <w:tblPr>
+        <w:tblW w:w="10200" w:type="dxa"/>
+        <w:jc w:val="start"/>
+        <w:tblInd w:w="0" w:type="dxa"/>
+        <w:tblLayout w:type="fixed"/>
+        <w:tblCellMar>
+          <w:top w:w="28" w:type="dxa"/>
+          <w:start w:w="28" w:type="dxa"/>
+          <w:bottom w:w="28" w:type="dxa"/>
+          <w:end w:w="28" w:type="dxa"/>
+        </w:tblCellMar>
+      </w:tblPr>
+      <w:tblGrid>
+        <w:gridCol w:w="1725"/>
+        <w:gridCol w:w="4755"/>
+        <w:gridCol w:w="3720"/>
+      </w:tblGrid>
+      <w:tr>
+        <w:trPr>
+          <w:cantSplit w:val="true"/>
+        </w:trPr>
+        <w:tc>
+          <w:tcPr>
+            <w:tcW w:w="1725" w:type="dxa"/>
+            <w:tcBorders/>
+            <w:vAlign w:val="center"/>
+          </w:tcPr>
+          <w:p>
+            <w:pPr>
+              <w:pStyle w:val="TableHeading"/>
+              <w:suppressLineNumbers/>
+              <w:bidi w:val="0"/>
+              <w:jc w:val="center"/>
+              <w:rPr/>
+            </w:pPr>
+            <w:r>
+              <w:rPr/>
+              <w:t>Component</w:t>
+            </w:r>
+          </w:p>
+        </w:tc>
+        <w:tc>
+          <w:tcPr>
+            <w:tcW w:w="4755" w:type="dxa"/>
+            <w:tcBorders/>
+            <w:vAlign w:val="center"/>
+          </w:tcPr>
+          <w:p>
+            <w:pPr>
+              <w:pStyle w:val="TableHeading"/>
+              <w:suppressLineNumbers/>
+              <w:bidi w:val="0"/>
+              <w:jc w:val="center"/>
+              <w:rPr/>
+            </w:pPr>
+            <w:r>
+              <w:rPr/>
+              <w:t>Simple meaning and purpose</w:t>
+            </w:r>
+          </w:p>
+        </w:tc>
+        <w:tc>
+          <w:tcPr>
+            <w:tcW w:w="3720" w:type="dxa"/>
+            <w:tcBorders/>
+            <w:vAlign w:val="center"/>
+          </w:tcPr>
+          <w:p>
+            <w:pPr>
+              <w:pStyle w:val="TableHeading"/>
+              <w:suppressLineNumbers/>
+              <w:bidi w:val="0"/>
+              <w:jc w:val="center"/>
+              <w:rPr/>
+            </w:pPr>
+            <w:r>
+              <w:rPr/>
+              <w:t>Easy line to say</w:t>
+            </w:r>
+          </w:p>
+        </w:tc>
+      </w:tr>
+      <w:tr>
+        <w:trPr>
+          <w:cantSplit w:val="true"/>
+        </w:trPr>
+        <w:tc>
+          <w:tcPr>
+            <w:tcW w:w="1725" w:type="dxa"/>
+            <w:tcBorders/>
+            <w:vAlign w:val="center"/>
+          </w:tcPr>
+          <w:p>
+            <w:pPr>
+              <w:pStyle w:val="TableContents"/>
+              <w:widowControl w:val="false"/>
+              <w:suppressLineNumbers/>
+              <w:bidi w:val="0"/>
+              <w:jc w:val="start"/>
+              <w:rPr/>
+            </w:pPr>
+            <w:r>
+              <w:rPr>
+                <w:rStyle w:val="Strong"/>
+              </w:rPr>
+              <w:t>Main float</w:t>
+            </w:r>
+          </w:p>
+        </w:tc>
+        <w:tc>
+          <w:tcPr>
+            <w:tcW w:w="4755" w:type="dxa"/>
+            <w:tcBorders/>
+            <w:vAlign w:val="center"/>
+          </w:tcPr>
+          <w:p>
+            <w:pPr>
+              <w:pStyle w:val="TableContents"/>
+              <w:widowControl w:val="false"/>
+              <w:suppressLineNumbers/>
+              <w:bidi w:val="0"/>
+              <w:jc w:val="start"/>
+              <w:rPr/>
+            </w:pPr>
+            <w:r>
+              <w:rPr/>
+              <w:t>The round floating body that supports the complete structure and provides stability on the water.</w:t>
+            </w:r>
+          </w:p>
+        </w:tc>
+        <w:tc>
+          <w:tcPr>
+            <w:tcW w:w="3720" w:type="dxa"/>
+            <w:tcBorders/>
+            <w:vAlign w:val="center"/>
+          </w:tcPr>
+          <w:p>
+            <w:pPr>
+              <w:pStyle w:val="TableContents"/>
+              <w:widowControl w:val="false"/>
+              <w:suppressLineNumbers/>
+              <w:bidi w:val="0"/>
+              <w:jc w:val="start"/>
+              <w:rPr/>
+            </w:pPr>
+            <w:r>
+              <w:rPr/>
+              <w:t>“</w:t>
+            </w:r>
+            <w:r>
+              <w:rPr/>
+              <w:t>This is the body that keeps FALCON floating and supports all equipment above the water.”</w:t>
+            </w:r>
+          </w:p>
+        </w:tc>
+      </w:tr>
+      <w:tr>
+        <w:trPr>
+          <w:cantSplit w:val="true"/>
+        </w:trPr>
+        <w:tc>
+          <w:tcPr>
+            <w:tcW w:w="1725" w:type="dxa"/>
+            <w:tcBorders/>
+            <w:vAlign w:val="center"/>
+          </w:tcPr>
+          <w:p>
+            <w:pPr>
+              <w:pStyle w:val="TableContents"/>
+              <w:widowControl w:val="false"/>
+              <w:suppressLineNumbers/>
+              <w:bidi w:val="0"/>
+              <w:jc w:val="start"/>
+              <w:rPr/>
+            </w:pPr>
+            <w:r>
+              <w:rPr>
+                <w:rStyle w:val="Strong"/>
+              </w:rPr>
+              <w:t>Tower and frame</w:t>
+            </w:r>
+          </w:p>
+        </w:tc>
+        <w:tc>
+          <w:tcPr>
+            <w:tcW w:w="4755" w:type="dxa"/>
+            <w:tcBorders/>
+            <w:vAlign w:val="center"/>
+          </w:tcPr>
+          <w:p>
+            <w:pPr>
+              <w:pStyle w:val="TableContents"/>
+              <w:widowControl w:val="false"/>
+              <w:suppressLineNumbers/>
+              <w:bidi w:val="0"/>
+              <w:jc w:val="start"/>
+              <w:rPr/>
+            </w:pPr>
+            <w:r>
+              <w:rPr/>
+              <w:t>The strong structure that holds the sensors, solar panels, antennas, and electronics pod at their intended positions.</w:t>
+            </w:r>
+          </w:p>
+        </w:tc>
+        <w:tc>
+          <w:tcPr>
+            <w:tcW w:w="3720" w:type="dxa"/>
+            <w:tcBorders/>
+            <w:vAlign w:val="center"/>
+          </w:tcPr>
+          <w:p>
+            <w:pPr>
+              <w:pStyle w:val="TableContents"/>
+              <w:widowControl w:val="false"/>
+              <w:suppressLineNumbers/>
+              <w:bidi w:val="0"/>
+              <w:jc w:val="start"/>
+              <w:rPr/>
+            </w:pPr>
+            <w:r>
+              <w:rPr/>
+              <w:t>“</w:t>
+            </w:r>
+            <w:r>
+              <w:rPr/>
+              <w:t>The tower keeps the equipment secure and gives the upper sensors a clear position.”</w:t>
+            </w:r>
+          </w:p>
+        </w:tc>
+      </w:tr>
+      <w:tr>
+        <w:trPr>
+          <w:cantSplit w:val="true"/>
+        </w:trPr>
+        <w:tc>
+          <w:tcPr>
+            <w:tcW w:w="1725" w:type="dxa"/>
+            <w:tcBorders/>
+            <w:vAlign w:val="center"/>
+          </w:tcPr>
+          <w:p>
+            <w:pPr>
+              <w:pStyle w:val="TableContents"/>
+              <w:widowControl w:val="false"/>
+              <w:suppressLineNumbers/>
+              <w:bidi w:val="0"/>
+              <w:jc w:val="start"/>
+              <w:rPr/>
+            </w:pPr>
+            <w:r>
+              <w:rPr>
+                <w:rStyle w:val="Strong"/>
+              </w:rPr>
+              <w:t>Upper electronics pod</w:t>
+            </w:r>
+          </w:p>
+        </w:tc>
+        <w:tc>
+          <w:tcPr>
+            <w:tcW w:w="4755" w:type="dxa"/>
+            <w:tcBorders/>
+            <w:vAlign w:val="center"/>
+          </w:tcPr>
+          <w:p>
+            <w:pPr>
+              <w:pStyle w:val="TableContents"/>
+              <w:widowControl w:val="false"/>
+              <w:suppressLineNumbers/>
+              <w:bidi w:val="0"/>
+              <w:jc w:val="start"/>
+              <w:rPr/>
+            </w:pPr>
+            <w:r>
+              <w:rPr/>
+              <w:t>The sealed and serviceable box that protects the computers and electronic boards from water and weather.</w:t>
+            </w:r>
+          </w:p>
+        </w:tc>
+        <w:tc>
+          <w:tcPr>
+            <w:tcW w:w="3720" w:type="dxa"/>
+            <w:tcBorders/>
+            <w:vAlign w:val="center"/>
+          </w:tcPr>
+          <w:p>
+            <w:pPr>
+              <w:pStyle w:val="TableContents"/>
+              <w:widowControl w:val="false"/>
+              <w:suppressLineNumbers/>
+              <w:bidi w:val="0"/>
+              <w:jc w:val="start"/>
+              <w:rPr/>
+            </w:pPr>
+            <w:r>
+              <w:rPr/>
+              <w:t>“</w:t>
+            </w:r>
+            <w:r>
+              <w:rPr/>
+              <w:t>This is the dry control box or brain compartment of the buoy.”</w:t>
+            </w:r>
+          </w:p>
+        </w:tc>
+      </w:tr>
+      <w:tr>
+        <w:trPr>
+          <w:cantSplit w:val="true"/>
+        </w:trPr>
+        <w:tc>
+          <w:tcPr>
+            <w:tcW w:w="1725" w:type="dxa"/>
+            <w:tcBorders/>
+            <w:vAlign w:val="center"/>
+          </w:tcPr>
+          <w:p>
+            <w:pPr>
+              <w:pStyle w:val="TableContents"/>
+              <w:widowControl w:val="false"/>
+              <w:suppressLineNumbers/>
+              <w:bidi w:val="0"/>
+              <w:jc w:val="start"/>
+              <w:rPr/>
+            </w:pPr>
+            <w:r>
+              <w:rPr>
+                <w:rStyle w:val="Strong"/>
+              </w:rPr>
+              <w:t>Wind sensor / SEN-15901</w:t>
+            </w:r>
+          </w:p>
+        </w:tc>
+        <w:tc>
+          <w:tcPr>
+            <w:tcW w:w="4755" w:type="dxa"/>
+            <w:tcBorders/>
+            <w:vAlign w:val="center"/>
+          </w:tcPr>
+          <w:p>
+            <w:pPr>
+              <w:pStyle w:val="TableContents"/>
+              <w:widowControl w:val="false"/>
+              <w:suppressLineNumbers/>
+              <w:bidi w:val="0"/>
+              <w:jc w:val="start"/>
+              <w:rPr/>
+            </w:pPr>
+            <w:r>
+              <w:rPr/>
+              <w:t>The anemometer measures wind speed, while the wind vane identifies wind direction.</w:t>
+            </w:r>
+          </w:p>
+        </w:tc>
+        <w:tc>
+          <w:tcPr>
+            <w:tcW w:w="3720" w:type="dxa"/>
+            <w:tcBorders/>
+            <w:vAlign w:val="center"/>
+          </w:tcPr>
+          <w:p>
+            <w:pPr>
+              <w:pStyle w:val="TableContents"/>
+              <w:widowControl w:val="false"/>
+              <w:suppressLineNumbers/>
+              <w:bidi w:val="0"/>
+              <w:jc w:val="start"/>
+              <w:rPr/>
+            </w:pPr>
+            <w:r>
+              <w:rPr/>
+              <w:t>“</w:t>
+            </w:r>
+            <w:r>
+              <w:rPr/>
+              <w:t>This tells us how fast the wind is moving and where it is coming from.”</w:t>
+            </w:r>
+          </w:p>
+        </w:tc>
+      </w:tr>
+      <w:tr>
+        <w:trPr>
+          <w:cantSplit w:val="true"/>
+        </w:trPr>
+        <w:tc>
+          <w:tcPr>
+            <w:tcW w:w="1725" w:type="dxa"/>
+            <w:tcBorders/>
+            <w:vAlign w:val="center"/>
+          </w:tcPr>
+          <w:p>
+            <w:pPr>
+              <w:pStyle w:val="TableContents"/>
+              <w:widowControl w:val="false"/>
+              <w:suppressLineNumbers/>
+              <w:bidi w:val="0"/>
+              <w:jc w:val="start"/>
+              <w:rPr/>
+            </w:pPr>
+            <w:r>
+              <w:rPr>
+                <w:rStyle w:val="Strong"/>
+              </w:rPr>
+              <w:t>GPS module</w:t>
+            </w:r>
+          </w:p>
+        </w:tc>
+        <w:tc>
+          <w:tcPr>
+            <w:tcW w:w="4755" w:type="dxa"/>
+            <w:tcBorders/>
+            <w:vAlign w:val="center"/>
+          </w:tcPr>
+          <w:p>
+            <w:pPr>
+              <w:pStyle w:val="TableContents"/>
+              <w:widowControl w:val="false"/>
+              <w:suppressLineNumbers/>
+              <w:bidi w:val="0"/>
+              <w:jc w:val="start"/>
+              <w:rPr/>
+            </w:pPr>
+            <w:r>
+              <w:rPr/>
+              <w:t>Provides the buoy's position, movement, heading-related information, and satellite-fix quality.</w:t>
+            </w:r>
+          </w:p>
+        </w:tc>
+        <w:tc>
+          <w:tcPr>
+            <w:tcW w:w="3720" w:type="dxa"/>
+            <w:tcBorders/>
+            <w:vAlign w:val="center"/>
+          </w:tcPr>
+          <w:p>
+            <w:pPr>
+              <w:pStyle w:val="TableContents"/>
+              <w:widowControl w:val="false"/>
+              <w:suppressLineNumbers/>
+              <w:bidi w:val="0"/>
+              <w:jc w:val="start"/>
+              <w:rPr/>
+            </w:pPr>
+            <w:r>
+              <w:rPr/>
+              <w:t>“</w:t>
+            </w:r>
+            <w:r>
+              <w:rPr/>
+              <w:t>GPS tells us where the buoy is and helps us detect if it moves unusually far from its deployment point.”</w:t>
+            </w:r>
+          </w:p>
+        </w:tc>
+      </w:tr>
+      <w:tr>
+        <w:trPr>
+          <w:cantSplit w:val="true"/>
+        </w:trPr>
+        <w:tc>
+          <w:tcPr>
+            <w:tcW w:w="1725" w:type="dxa"/>
+            <w:tcBorders/>
+            <w:vAlign w:val="center"/>
+          </w:tcPr>
+          <w:p>
+            <w:pPr>
+              <w:pStyle w:val="TableContents"/>
+              <w:widowControl w:val="false"/>
+              <w:suppressLineNumbers/>
+              <w:bidi w:val="0"/>
+              <w:jc w:val="start"/>
+              <w:rPr/>
+            </w:pPr>
+            <w:r>
+              <w:rPr>
+                <w:rStyle w:val="Strong"/>
+              </w:rPr>
+              <w:t>BNO085 IMU</w:t>
+            </w:r>
+          </w:p>
+        </w:tc>
+        <w:tc>
+          <w:tcPr>
+            <w:tcW w:w="4755" w:type="dxa"/>
+            <w:tcBorders/>
+            <w:vAlign w:val="center"/>
+          </w:tcPr>
+          <w:p>
+            <w:pPr>
+              <w:pStyle w:val="TableContents"/>
+              <w:widowControl w:val="false"/>
+              <w:suppressLineNumbers/>
+              <w:bidi w:val="0"/>
+              <w:jc w:val="start"/>
+              <w:rPr/>
+            </w:pPr>
+            <w:r>
+              <w:rPr/>
+              <w:t>An inertial measurement unit that measures orientation and motion, including roll, pitch, and rotational movement.</w:t>
+            </w:r>
+          </w:p>
+        </w:tc>
+        <w:tc>
+          <w:tcPr>
+            <w:tcW w:w="3720" w:type="dxa"/>
+            <w:tcBorders/>
+            <w:vAlign w:val="center"/>
+          </w:tcPr>
+          <w:p>
+            <w:pPr>
+              <w:pStyle w:val="TableContents"/>
+              <w:widowControl w:val="false"/>
+              <w:suppressLineNumbers/>
+              <w:bidi w:val="0"/>
+              <w:jc w:val="start"/>
+              <w:rPr/>
+            </w:pPr>
+            <w:r>
+              <w:rPr/>
+              <w:t>“</w:t>
+            </w:r>
+            <w:r>
+              <w:rPr/>
+              <w:t>This is the motion sensor. It tells us how the buoy tilts and moves with the waves.”</w:t>
+            </w:r>
+          </w:p>
+        </w:tc>
+      </w:tr>
+      <w:tr>
+        <w:trPr>
+          <w:cantSplit w:val="true"/>
+        </w:trPr>
+        <w:tc>
+          <w:tcPr>
+            <w:tcW w:w="1725" w:type="dxa"/>
+            <w:tcBorders/>
+            <w:vAlign w:val="center"/>
+          </w:tcPr>
+          <w:p>
+            <w:pPr>
+              <w:pStyle w:val="TableContents"/>
+              <w:widowControl w:val="false"/>
+              <w:suppressLineNumbers/>
+              <w:bidi w:val="0"/>
+              <w:jc w:val="start"/>
+              <w:rPr/>
+            </w:pPr>
+            <w:r>
+              <w:rPr>
+                <w:rStyle w:val="Strong"/>
+              </w:rPr>
+              <w:t>Bar02 pressure sensor</w:t>
+            </w:r>
+          </w:p>
+        </w:tc>
+        <w:tc>
+          <w:tcPr>
+            <w:tcW w:w="4755" w:type="dxa"/>
+            <w:tcBorders/>
+            <w:vAlign w:val="center"/>
+          </w:tcPr>
+          <w:p>
+            <w:pPr>
+              <w:pStyle w:val="TableContents"/>
+              <w:widowControl w:val="false"/>
+              <w:suppressLineNumbers/>
+              <w:bidi w:val="0"/>
+              <w:jc w:val="start"/>
+              <w:rPr/>
+            </w:pPr>
+            <w:r>
+              <w:rPr/>
+              <w:t>Measures water pressure. After calibration and depth correction, changes in pressure may help estimate water movement and wave characteristics.</w:t>
+            </w:r>
+          </w:p>
+        </w:tc>
+        <w:tc>
+          <w:tcPr>
+            <w:tcW w:w="3720" w:type="dxa"/>
+            <w:tcBorders/>
+            <w:vAlign w:val="center"/>
+          </w:tcPr>
+          <w:p>
+            <w:pPr>
+              <w:pStyle w:val="TableContents"/>
+              <w:widowControl w:val="false"/>
+              <w:suppressLineNumbers/>
+              <w:bidi w:val="0"/>
+              <w:jc w:val="start"/>
+              <w:rPr/>
+            </w:pPr>
+            <w:r>
+              <w:rPr/>
+              <w:t>“</w:t>
+            </w:r>
+            <w:r>
+              <w:rPr/>
+              <w:t>This sensor feels changes in water pressure, which may help us study waves after proper calibration.”</w:t>
+            </w:r>
+          </w:p>
+        </w:tc>
+      </w:tr>
+      <w:tr>
+        <w:trPr>
+          <w:cantSplit w:val="true"/>
+        </w:trPr>
+        <w:tc>
+          <w:tcPr>
+            <w:tcW w:w="1725" w:type="dxa"/>
+            <w:tcBorders/>
+            <w:vAlign w:val="center"/>
+          </w:tcPr>
+          <w:p>
+            <w:pPr>
+              <w:pStyle w:val="TableContents"/>
+              <w:widowControl w:val="false"/>
+              <w:suppressLineNumbers/>
+              <w:bidi w:val="0"/>
+              <w:jc w:val="start"/>
+              <w:rPr/>
+            </w:pPr>
+            <w:r>
+              <w:rPr>
+                <w:rStyle w:val="Strong"/>
+              </w:rPr>
+              <w:t>Optional DS18B20</w:t>
+            </w:r>
+          </w:p>
+        </w:tc>
+        <w:tc>
+          <w:tcPr>
+            <w:tcW w:w="4755" w:type="dxa"/>
+            <w:tcBorders/>
+            <w:vAlign w:val="center"/>
+          </w:tcPr>
+          <w:p>
+            <w:pPr>
+              <w:pStyle w:val="TableContents"/>
+              <w:widowControl w:val="false"/>
+              <w:suppressLineNumbers/>
+              <w:bidi w:val="0"/>
+              <w:jc w:val="start"/>
+              <w:rPr/>
+            </w:pPr>
+            <w:r>
+              <w:rPr/>
+              <w:t>A waterproof temperature probe intended for measuring water temperature if it is included in the approved final scope.</w:t>
+            </w:r>
+          </w:p>
+        </w:tc>
+        <w:tc>
+          <w:tcPr>
+            <w:tcW w:w="3720" w:type="dxa"/>
+            <w:tcBorders/>
+            <w:vAlign w:val="center"/>
+          </w:tcPr>
+          <w:p>
+            <w:pPr>
+              <w:pStyle w:val="TableContents"/>
+              <w:widowControl w:val="false"/>
+              <w:suppressLineNumbers/>
+              <w:bidi w:val="0"/>
+              <w:jc w:val="start"/>
+              <w:rPr/>
+            </w:pPr>
+            <w:r>
+              <w:rPr/>
+              <w:t>“</w:t>
+            </w:r>
+            <w:r>
+              <w:rPr/>
+              <w:t>This optional probe measures the temperature of the surrounding water.”</w:t>
+            </w:r>
+          </w:p>
+        </w:tc>
+      </w:tr>
+      <w:tr>
+        <w:trPr>
+          <w:cantSplit w:val="true"/>
+        </w:trPr>
+        <w:tc>
+          <w:tcPr>
+            <w:tcW w:w="1725" w:type="dxa"/>
+            <w:tcBorders/>
+            <w:vAlign w:val="center"/>
+          </w:tcPr>
+          <w:p>
+            <w:pPr>
+              <w:pStyle w:val="TableContents"/>
+              <w:widowControl w:val="false"/>
+              <w:suppressLineNumbers/>
+              <w:bidi w:val="0"/>
+              <w:jc w:val="start"/>
+              <w:rPr/>
+            </w:pPr>
+            <w:r>
+              <w:rPr>
+                <w:rStyle w:val="Strong"/>
+              </w:rPr>
+              <w:t>ESP32 DevKit V1</w:t>
+            </w:r>
+          </w:p>
+        </w:tc>
+        <w:tc>
+          <w:tcPr>
+            <w:tcW w:w="4755" w:type="dxa"/>
+            <w:tcBorders/>
+            <w:vAlign w:val="center"/>
+          </w:tcPr>
+          <w:p>
+            <w:pPr>
+              <w:pStyle w:val="TableContents"/>
+              <w:widowControl w:val="false"/>
+              <w:suppressLineNumbers/>
+              <w:bidi w:val="0"/>
+              <w:jc w:val="start"/>
+              <w:rPr/>
+            </w:pPr>
+            <w:r>
+              <w:rPr/>
+              <w:t>The microcontroller that reads sensors repeatedly, performs basic checks, and packages the readings for transmission.</w:t>
+            </w:r>
+          </w:p>
+        </w:tc>
+        <w:tc>
+          <w:tcPr>
+            <w:tcW w:w="3720" w:type="dxa"/>
+            <w:tcBorders/>
+            <w:vAlign w:val="center"/>
+          </w:tcPr>
+          <w:p>
+            <w:pPr>
+              <w:pStyle w:val="TableContents"/>
+              <w:widowControl w:val="false"/>
+              <w:suppressLineNumbers/>
+              <w:bidi w:val="0"/>
+              <w:jc w:val="start"/>
+              <w:rPr/>
+            </w:pPr>
+            <w:r>
+              <w:rPr/>
+              <w:t>“</w:t>
+            </w:r>
+            <w:r>
+              <w:rPr/>
+              <w:t>The ESP32 is the sensor reader. It gathers the raw measurements and sends them in an organized format.”</w:t>
+            </w:r>
+          </w:p>
+        </w:tc>
+      </w:tr>
+      <w:tr>
+        <w:trPr>
+          <w:cantSplit w:val="true"/>
+        </w:trPr>
+        <w:tc>
+          <w:tcPr>
+            <w:tcW w:w="1725" w:type="dxa"/>
+            <w:tcBorders/>
+            <w:vAlign w:val="center"/>
+          </w:tcPr>
+          <w:p>
+            <w:pPr>
+              <w:pStyle w:val="TableContents"/>
+              <w:widowControl w:val="false"/>
+              <w:suppressLineNumbers/>
+              <w:bidi w:val="0"/>
+              <w:jc w:val="start"/>
+              <w:rPr/>
+            </w:pPr>
+            <w:r>
+              <w:rPr>
+                <w:rStyle w:val="Strong"/>
+              </w:rPr>
+              <w:t>Orange Pi Zero 3</w:t>
+            </w:r>
+          </w:p>
+        </w:tc>
+        <w:tc>
+          <w:tcPr>
+            <w:tcW w:w="4755" w:type="dxa"/>
+            <w:tcBorders/>
+            <w:vAlign w:val="center"/>
+          </w:tcPr>
+          <w:p>
+            <w:pPr>
+              <w:pStyle w:val="TableContents"/>
+              <w:widowControl w:val="false"/>
+              <w:suppressLineNumbers/>
+              <w:bidi w:val="0"/>
+              <w:jc w:val="start"/>
+              <w:rPr/>
+            </w:pPr>
+            <w:r>
+              <w:rPr/>
+              <w:t>The small Linux computer that stores data, performs heavier calculations, runs the API, hosts the dashboard, and later executes the validated model.</w:t>
+            </w:r>
+          </w:p>
+        </w:tc>
+        <w:tc>
+          <w:tcPr>
+            <w:tcW w:w="3720" w:type="dxa"/>
+            <w:tcBorders/>
+            <w:vAlign w:val="center"/>
+          </w:tcPr>
+          <w:p>
+            <w:pPr>
+              <w:pStyle w:val="TableContents"/>
+              <w:widowControl w:val="false"/>
+              <w:suppressLineNumbers/>
+              <w:bidi w:val="0"/>
+              <w:jc w:val="start"/>
+              <w:rPr/>
+            </w:pPr>
+            <w:r>
+              <w:rPr/>
+              <w:t>“</w:t>
+            </w:r>
+            <w:r>
+              <w:rPr/>
+              <w:t>The Orange Pi is the onboard computer. It saves, processes, and presents the information.”</w:t>
+            </w:r>
+          </w:p>
+        </w:tc>
+      </w:tr>
+      <w:tr>
+        <w:trPr>
+          <w:cantSplit w:val="true"/>
+        </w:trPr>
+        <w:tc>
+          <w:tcPr>
+            <w:tcW w:w="1725" w:type="dxa"/>
+            <w:tcBorders/>
+            <w:vAlign w:val="center"/>
+          </w:tcPr>
+          <w:p>
+            <w:pPr>
+              <w:pStyle w:val="TableContents"/>
+              <w:widowControl w:val="false"/>
+              <w:suppressLineNumbers/>
+              <w:bidi w:val="0"/>
+              <w:jc w:val="start"/>
+              <w:rPr/>
+            </w:pPr>
+            <w:r>
+              <w:rPr>
+                <w:rStyle w:val="Strong"/>
+              </w:rPr>
+              <w:t>MicroSD or eMMC storage</w:t>
+            </w:r>
+          </w:p>
+        </w:tc>
+        <w:tc>
+          <w:tcPr>
+            <w:tcW w:w="4755" w:type="dxa"/>
+            <w:tcBorders/>
+            <w:vAlign w:val="center"/>
+          </w:tcPr>
+          <w:p>
+            <w:pPr>
+              <w:pStyle w:val="TableContents"/>
+              <w:widowControl w:val="false"/>
+              <w:suppressLineNumbers/>
+              <w:bidi w:val="0"/>
+              <w:jc w:val="start"/>
+              <w:rPr/>
+            </w:pPr>
+            <w:r>
+              <w:rPr/>
+              <w:t>Stores the operating system, database, dashboard files, sensor history, and test records.</w:t>
+            </w:r>
+          </w:p>
+        </w:tc>
+        <w:tc>
+          <w:tcPr>
+            <w:tcW w:w="3720" w:type="dxa"/>
+            <w:tcBorders/>
+            <w:vAlign w:val="center"/>
+          </w:tcPr>
+          <w:p>
+            <w:pPr>
+              <w:pStyle w:val="TableContents"/>
+              <w:widowControl w:val="false"/>
+              <w:suppressLineNumbers/>
+              <w:bidi w:val="0"/>
+              <w:jc w:val="start"/>
+              <w:rPr/>
+            </w:pPr>
+            <w:r>
+              <w:rPr/>
+              <w:t>“</w:t>
+            </w:r>
+            <w:r>
+              <w:rPr/>
+              <w:t>This is the buoy's local memory, so records can remain available even without internet.”</w:t>
+            </w:r>
+          </w:p>
+        </w:tc>
+      </w:tr>
+      <w:tr>
+        <w:trPr>
+          <w:cantSplit w:val="true"/>
+        </w:trPr>
+        <w:tc>
+          <w:tcPr>
+            <w:tcW w:w="1725" w:type="dxa"/>
+            <w:tcBorders/>
+            <w:vAlign w:val="center"/>
+          </w:tcPr>
+          <w:p>
+            <w:pPr>
+              <w:pStyle w:val="TableContents"/>
+              <w:widowControl w:val="false"/>
+              <w:suppressLineNumbers/>
+              <w:bidi w:val="0"/>
+              <w:jc w:val="start"/>
+              <w:rPr/>
+            </w:pPr>
+            <w:r>
+              <w:rPr>
+                <w:rStyle w:val="Strong"/>
+              </w:rPr>
+              <w:t>ADS1115</w:t>
+            </w:r>
+          </w:p>
+        </w:tc>
+        <w:tc>
+          <w:tcPr>
+            <w:tcW w:w="4755" w:type="dxa"/>
+            <w:tcBorders/>
+            <w:vAlign w:val="center"/>
+          </w:tcPr>
+          <w:p>
+            <w:pPr>
+              <w:pStyle w:val="TableContents"/>
+              <w:widowControl w:val="false"/>
+              <w:suppressLineNumbers/>
+              <w:bidi w:val="0"/>
+              <w:jc w:val="start"/>
+              <w:rPr/>
+            </w:pPr>
+            <w:r>
+              <w:rPr/>
+              <w:t>A high-resolution analog-to-digital converter used to read the changing electrical signal from the wind-direction vane more consistently.</w:t>
+            </w:r>
+          </w:p>
+        </w:tc>
+        <w:tc>
+          <w:tcPr>
+            <w:tcW w:w="3720" w:type="dxa"/>
+            <w:tcBorders/>
+            <w:vAlign w:val="center"/>
+          </w:tcPr>
+          <w:p>
+            <w:pPr>
+              <w:pStyle w:val="TableContents"/>
+              <w:widowControl w:val="false"/>
+              <w:suppressLineNumbers/>
+              <w:bidi w:val="0"/>
+              <w:jc w:val="start"/>
+              <w:rPr/>
+            </w:pPr>
+            <w:r>
+              <w:rPr/>
+              <w:t>“</w:t>
+            </w:r>
+            <w:r>
+              <w:rPr/>
+              <w:t>This converts the wind vane's electrical signal into a value the ESP32 can understand.”</w:t>
+            </w:r>
+          </w:p>
+        </w:tc>
+      </w:tr>
+      <w:tr>
+        <w:trPr>
+          <w:cantSplit w:val="true"/>
+        </w:trPr>
+        <w:tc>
+          <w:tcPr>
+            <w:tcW w:w="1725" w:type="dxa"/>
+            <w:tcBorders/>
+            <w:vAlign w:val="center"/>
+          </w:tcPr>
+          <w:p>
+            <w:pPr>
+              <w:pStyle w:val="TableContents"/>
+              <w:widowControl w:val="false"/>
+              <w:suppressLineNumbers/>
+              <w:bidi w:val="0"/>
+              <w:jc w:val="start"/>
+              <w:rPr/>
+            </w:pPr>
+            <w:r>
+              <w:rPr>
+                <w:rStyle w:val="Strong"/>
+              </w:rPr>
+              <w:t>MCP9808</w:t>
+            </w:r>
+          </w:p>
+        </w:tc>
+        <w:tc>
+          <w:tcPr>
+            <w:tcW w:w="4755" w:type="dxa"/>
+            <w:tcBorders/>
+            <w:vAlign w:val="center"/>
+          </w:tcPr>
+          <w:p>
+            <w:pPr>
+              <w:pStyle w:val="TableContents"/>
+              <w:widowControl w:val="false"/>
+              <w:suppressLineNumbers/>
+              <w:bidi w:val="0"/>
+              <w:jc w:val="start"/>
+              <w:rPr/>
+            </w:pPr>
+            <w:r>
+              <w:rPr/>
+              <w:t>Measures temperature inside the electronics enclosure to identify overheating risk.</w:t>
+            </w:r>
+          </w:p>
+        </w:tc>
+        <w:tc>
+          <w:tcPr>
+            <w:tcW w:w="3720" w:type="dxa"/>
+            <w:tcBorders/>
+            <w:vAlign w:val="center"/>
+          </w:tcPr>
+          <w:p>
+            <w:pPr>
+              <w:pStyle w:val="TableContents"/>
+              <w:widowControl w:val="false"/>
+              <w:suppressLineNumbers/>
+              <w:bidi w:val="0"/>
+              <w:jc w:val="start"/>
+              <w:rPr/>
+            </w:pPr>
+            <w:r>
+              <w:rPr/>
+              <w:t>“</w:t>
+            </w:r>
+            <w:r>
+              <w:rPr/>
+              <w:t>This checks whether the electronics box is becoming too hot.”</w:t>
+            </w:r>
+          </w:p>
+        </w:tc>
+      </w:tr>
+      <w:tr>
+        <w:trPr>
+          <w:cantSplit w:val="true"/>
+        </w:trPr>
+        <w:tc>
+          <w:tcPr>
+            <w:tcW w:w="1725" w:type="dxa"/>
+            <w:tcBorders/>
+            <w:vAlign w:val="center"/>
+          </w:tcPr>
+          <w:p>
+            <w:pPr>
+              <w:pStyle w:val="TableContents"/>
+              <w:widowControl w:val="false"/>
+              <w:suppressLineNumbers/>
+              <w:bidi w:val="0"/>
+              <w:jc w:val="start"/>
+              <w:rPr/>
+            </w:pPr>
+            <w:r>
+              <w:rPr>
+                <w:rStyle w:val="Strong"/>
+              </w:rPr>
+              <w:t>Two INA260 monitors</w:t>
+            </w:r>
+          </w:p>
+        </w:tc>
+        <w:tc>
+          <w:tcPr>
+            <w:tcW w:w="4755" w:type="dxa"/>
+            <w:tcBorders/>
+            <w:vAlign w:val="center"/>
+          </w:tcPr>
+          <w:p>
+            <w:pPr>
+              <w:pStyle w:val="TableContents"/>
+              <w:widowControl w:val="false"/>
+              <w:suppressLineNumbers/>
+              <w:bidi w:val="0"/>
+              <w:jc w:val="start"/>
+              <w:rPr/>
+            </w:pPr>
+            <w:r>
+              <w:rPr/>
+              <w:t>One board measures the battery branch and the other measures the solar branch. They report voltage, current, and power flow.</w:t>
+            </w:r>
+          </w:p>
+        </w:tc>
+        <w:tc>
+          <w:tcPr>
+            <w:tcW w:w="3720" w:type="dxa"/>
+            <w:tcBorders/>
+            <w:vAlign w:val="center"/>
+          </w:tcPr>
+          <w:p>
+            <w:pPr>
+              <w:pStyle w:val="TableContents"/>
+              <w:widowControl w:val="false"/>
+              <w:suppressLineNumbers/>
+              <w:bidi w:val="0"/>
+              <w:jc w:val="start"/>
+              <w:rPr/>
+            </w:pPr>
+            <w:r>
+              <w:rPr/>
+              <w:t>“</w:t>
+            </w:r>
+            <w:r>
+              <w:rPr/>
+              <w:t>These are power meters: one watches the battery and one watches the solar charging.”</w:t>
+            </w:r>
+          </w:p>
+        </w:tc>
+      </w:tr>
+      <w:tr>
+        <w:trPr>
+          <w:cantSplit w:val="true"/>
+        </w:trPr>
+        <w:tc>
+          <w:tcPr>
+            <w:tcW w:w="1725" w:type="dxa"/>
+            <w:tcBorders/>
+            <w:vAlign w:val="center"/>
+          </w:tcPr>
+          <w:p>
+            <w:pPr>
+              <w:pStyle w:val="TableContents"/>
+              <w:widowControl w:val="false"/>
+              <w:suppressLineNumbers/>
+              <w:bidi w:val="0"/>
+              <w:jc w:val="start"/>
+              <w:rPr/>
+            </w:pPr>
+            <w:r>
+              <w:rPr>
+                <w:rStyle w:val="Strong"/>
+              </w:rPr>
+              <w:t>Solar panels</w:t>
+            </w:r>
+          </w:p>
+        </w:tc>
+        <w:tc>
+          <w:tcPr>
+            <w:tcW w:w="4755" w:type="dxa"/>
+            <w:tcBorders/>
+            <w:vAlign w:val="center"/>
+          </w:tcPr>
+          <w:p>
+            <w:pPr>
+              <w:pStyle w:val="TableContents"/>
+              <w:widowControl w:val="false"/>
+              <w:suppressLineNumbers/>
+              <w:bidi w:val="0"/>
+              <w:jc w:val="start"/>
+              <w:rPr/>
+            </w:pPr>
+            <w:r>
+              <w:rPr/>
+              <w:t>Convert sunlight into electrical energy for charging the battery and supporting longer operation.</w:t>
+            </w:r>
+          </w:p>
+        </w:tc>
+        <w:tc>
+          <w:tcPr>
+            <w:tcW w:w="3720" w:type="dxa"/>
+            <w:tcBorders/>
+            <w:vAlign w:val="center"/>
+          </w:tcPr>
+          <w:p>
+            <w:pPr>
+              <w:pStyle w:val="TableContents"/>
+              <w:widowControl w:val="false"/>
+              <w:suppressLineNumbers/>
+              <w:bidi w:val="0"/>
+              <w:jc w:val="start"/>
+              <w:rPr/>
+            </w:pPr>
+            <w:r>
+              <w:rPr/>
+              <w:t>“</w:t>
+            </w:r>
+            <w:r>
+              <w:rPr/>
+              <w:t>The solar panels provide renewable energy for the buoy.”</w:t>
+            </w:r>
+          </w:p>
+        </w:tc>
+      </w:tr>
+      <w:tr>
+        <w:trPr>
+          <w:cantSplit w:val="true"/>
+        </w:trPr>
+        <w:tc>
+          <w:tcPr>
+            <w:tcW w:w="1725" w:type="dxa"/>
+            <w:tcBorders/>
+            <w:vAlign w:val="center"/>
+          </w:tcPr>
+          <w:p>
+            <w:pPr>
+              <w:pStyle w:val="TableContents"/>
+              <w:widowControl w:val="false"/>
+              <w:suppressLineNumbers/>
+              <w:bidi w:val="0"/>
+              <w:jc w:val="start"/>
+              <w:rPr/>
+            </w:pPr>
+            <w:r>
+              <w:rPr>
+                <w:rStyle w:val="Strong"/>
+              </w:rPr>
+              <w:t>MPPT solar charger</w:t>
+            </w:r>
+          </w:p>
+        </w:tc>
+        <w:tc>
+          <w:tcPr>
+            <w:tcW w:w="4755" w:type="dxa"/>
+            <w:tcBorders/>
+            <w:vAlign w:val="center"/>
+          </w:tcPr>
+          <w:p>
+            <w:pPr>
+              <w:pStyle w:val="TableContents"/>
+              <w:widowControl w:val="false"/>
+              <w:suppressLineNumbers/>
+              <w:bidi w:val="0"/>
+              <w:jc w:val="start"/>
+              <w:rPr/>
+            </w:pPr>
+            <w:r>
+              <w:rPr/>
+              <w:t>Controls energy transfer from the solar panels to the battery and helps charging operate efficiently and safely.</w:t>
+            </w:r>
+          </w:p>
+        </w:tc>
+        <w:tc>
+          <w:tcPr>
+            <w:tcW w:w="3720" w:type="dxa"/>
+            <w:tcBorders/>
+            <w:vAlign w:val="center"/>
+          </w:tcPr>
+          <w:p>
+            <w:pPr>
+              <w:pStyle w:val="TableContents"/>
+              <w:widowControl w:val="false"/>
+              <w:suppressLineNumbers/>
+              <w:bidi w:val="0"/>
+              <w:jc w:val="start"/>
+              <w:rPr/>
+            </w:pPr>
+            <w:r>
+              <w:rPr/>
+              <w:t>“</w:t>
+            </w:r>
+            <w:r>
+              <w:rPr/>
+              <w:t>This is the charging controller between the solar panels and the battery.”</w:t>
+            </w:r>
+          </w:p>
+        </w:tc>
+      </w:tr>
+      <w:tr>
+        <w:trPr>
+          <w:cantSplit w:val="true"/>
+        </w:trPr>
+        <w:tc>
+          <w:tcPr>
+            <w:tcW w:w="1725" w:type="dxa"/>
+            <w:tcBorders/>
+            <w:vAlign w:val="center"/>
+          </w:tcPr>
+          <w:p>
+            <w:pPr>
+              <w:pStyle w:val="TableContents"/>
+              <w:widowControl w:val="false"/>
+              <w:suppressLineNumbers/>
+              <w:bidi w:val="0"/>
+              <w:jc w:val="start"/>
+              <w:rPr/>
+            </w:pPr>
+            <w:r>
+              <w:rPr>
+                <w:rStyle w:val="Strong"/>
+              </w:rPr>
+              <w:t>12.8 V LiFePO4 battery</w:t>
+            </w:r>
+          </w:p>
+        </w:tc>
+        <w:tc>
+          <w:tcPr>
+            <w:tcW w:w="4755" w:type="dxa"/>
+            <w:tcBorders/>
+            <w:vAlign w:val="center"/>
+          </w:tcPr>
+          <w:p>
+            <w:pPr>
+              <w:pStyle w:val="TableContents"/>
+              <w:widowControl w:val="false"/>
+              <w:suppressLineNumbers/>
+              <w:bidi w:val="0"/>
+              <w:jc w:val="start"/>
+              <w:rPr/>
+            </w:pPr>
+            <w:r>
+              <w:rPr/>
+              <w:t>Stores solar energy and powers the system when sunlight is weak or unavailable. Final capacity still requires measured load testing.</w:t>
+            </w:r>
+          </w:p>
+        </w:tc>
+        <w:tc>
+          <w:tcPr>
+            <w:tcW w:w="3720" w:type="dxa"/>
+            <w:tcBorders/>
+            <w:vAlign w:val="center"/>
+          </w:tcPr>
+          <w:p>
+            <w:pPr>
+              <w:pStyle w:val="TableContents"/>
+              <w:widowControl w:val="false"/>
+              <w:suppressLineNumbers/>
+              <w:bidi w:val="0"/>
+              <w:jc w:val="start"/>
+              <w:rPr/>
+            </w:pPr>
+            <w:r>
+              <w:rPr/>
+              <w:t>“</w:t>
+            </w:r>
+            <w:r>
+              <w:rPr/>
+              <w:t>The battery stores energy so FALCON can continue operating when there is no sunlight.”</w:t>
+            </w:r>
+          </w:p>
+        </w:tc>
+      </w:tr>
+      <w:tr>
+        <w:trPr>
+          <w:cantSplit w:val="true"/>
+        </w:trPr>
+        <w:tc>
+          <w:tcPr>
+            <w:tcW w:w="1725" w:type="dxa"/>
+            <w:tcBorders/>
+            <w:vAlign w:val="center"/>
+          </w:tcPr>
+          <w:p>
+            <w:pPr>
+              <w:pStyle w:val="TableContents"/>
+              <w:widowControl w:val="false"/>
+              <w:suppressLineNumbers/>
+              <w:bidi w:val="0"/>
+              <w:jc w:val="start"/>
+              <w:rPr/>
+            </w:pPr>
+            <w:r>
+              <w:rPr>
+                <w:rStyle w:val="Strong"/>
+              </w:rPr>
+              <w:t>Fuse and disconnect</w:t>
+            </w:r>
+          </w:p>
+        </w:tc>
+        <w:tc>
+          <w:tcPr>
+            <w:tcW w:w="4755" w:type="dxa"/>
+            <w:tcBorders/>
+            <w:vAlign w:val="center"/>
+          </w:tcPr>
+          <w:p>
+            <w:pPr>
+              <w:pStyle w:val="TableContents"/>
+              <w:widowControl w:val="false"/>
+              <w:suppressLineNumbers/>
+              <w:bidi w:val="0"/>
+              <w:jc w:val="start"/>
+              <w:rPr/>
+            </w:pPr>
+            <w:r>
+              <w:rPr/>
+              <w:t>The fuse protects wiring during an electrical fault, while the disconnect allows power to be safely isolated during maintenance.</w:t>
+            </w:r>
+          </w:p>
+        </w:tc>
+        <w:tc>
+          <w:tcPr>
+            <w:tcW w:w="3720" w:type="dxa"/>
+            <w:tcBorders/>
+            <w:vAlign w:val="center"/>
+          </w:tcPr>
+          <w:p>
+            <w:pPr>
+              <w:pStyle w:val="TableContents"/>
+              <w:widowControl w:val="false"/>
+              <w:suppressLineNumbers/>
+              <w:bidi w:val="0"/>
+              <w:jc w:val="start"/>
+              <w:rPr/>
+            </w:pPr>
+            <w:r>
+              <w:rPr/>
+              <w:t>“</w:t>
+            </w:r>
+            <w:r>
+              <w:rPr/>
+              <w:t>These are safety parts that protect the system and let us turn off power before servicing it.”</w:t>
+            </w:r>
+          </w:p>
+        </w:tc>
+      </w:tr>
+      <w:tr>
+        <w:trPr>
+          <w:cantSplit w:val="true"/>
+        </w:trPr>
+        <w:tc>
+          <w:tcPr>
+            <w:tcW w:w="1725" w:type="dxa"/>
+            <w:tcBorders/>
+            <w:vAlign w:val="center"/>
+          </w:tcPr>
+          <w:p>
+            <w:pPr>
+              <w:pStyle w:val="TableContents"/>
+              <w:widowControl w:val="false"/>
+              <w:suppressLineNumbers/>
+              <w:bidi w:val="0"/>
+              <w:jc w:val="start"/>
+              <w:rPr/>
+            </w:pPr>
+            <w:r>
+              <w:rPr>
+                <w:rStyle w:val="Strong"/>
+              </w:rPr>
+              <w:t>5 V buck converters</w:t>
+            </w:r>
+          </w:p>
+        </w:tc>
+        <w:tc>
+          <w:tcPr>
+            <w:tcW w:w="4755" w:type="dxa"/>
+            <w:tcBorders/>
+            <w:vAlign w:val="center"/>
+          </w:tcPr>
+          <w:p>
+            <w:pPr>
+              <w:pStyle w:val="TableContents"/>
+              <w:widowControl w:val="false"/>
+              <w:suppressLineNumbers/>
+              <w:bidi w:val="0"/>
+              <w:jc w:val="start"/>
+              <w:rPr/>
+            </w:pPr>
+            <w:r>
+              <w:rPr/>
+              <w:t>Safely reduce the battery voltage to regulated 5 V supplies. Separate branches are planned for the Orange Pi and ESP32 peripherals.</w:t>
+            </w:r>
+          </w:p>
+        </w:tc>
+        <w:tc>
+          <w:tcPr>
+            <w:tcW w:w="3720" w:type="dxa"/>
+            <w:tcBorders/>
+            <w:vAlign w:val="center"/>
+          </w:tcPr>
+          <w:p>
+            <w:pPr>
+              <w:pStyle w:val="TableContents"/>
+              <w:widowControl w:val="false"/>
+              <w:suppressLineNumbers/>
+              <w:bidi w:val="0"/>
+              <w:jc w:val="start"/>
+              <w:rPr/>
+            </w:pPr>
+            <w:r>
+              <w:rPr/>
+              <w:t>“</w:t>
+            </w:r>
+            <w:r>
+              <w:rPr/>
+              <w:t>These lower the battery voltage to the safe voltage required by the computers.”</w:t>
+            </w:r>
+          </w:p>
+        </w:tc>
+      </w:tr>
+      <w:tr>
+        <w:trPr>
+          <w:cantSplit w:val="true"/>
+        </w:trPr>
+        <w:tc>
+          <w:tcPr>
+            <w:tcW w:w="1725" w:type="dxa"/>
+            <w:tcBorders/>
+            <w:vAlign w:val="center"/>
+          </w:tcPr>
+          <w:p>
+            <w:pPr>
+              <w:pStyle w:val="TableContents"/>
+              <w:widowControl w:val="false"/>
+              <w:suppressLineNumbers/>
+              <w:bidi w:val="0"/>
+              <w:jc w:val="start"/>
+              <w:rPr/>
+            </w:pPr>
+            <w:r>
+              <w:rPr>
+                <w:rStyle w:val="Strong"/>
+              </w:rPr>
+              <w:t>Terminal blocks</w:t>
+            </w:r>
+          </w:p>
+        </w:tc>
+        <w:tc>
+          <w:tcPr>
+            <w:tcW w:w="4755" w:type="dxa"/>
+            <w:tcBorders/>
+            <w:vAlign w:val="center"/>
+          </w:tcPr>
+          <w:p>
+            <w:pPr>
+              <w:pStyle w:val="TableContents"/>
+              <w:widowControl w:val="false"/>
+              <w:suppressLineNumbers/>
+              <w:bidi w:val="0"/>
+              <w:jc w:val="start"/>
+              <w:rPr/>
+            </w:pPr>
+            <w:r>
+              <w:rPr/>
+              <w:t>Provide organized connection points for power, ground, and signals, making inspection and replacement easier.</w:t>
+            </w:r>
+          </w:p>
+        </w:tc>
+        <w:tc>
+          <w:tcPr>
+            <w:tcW w:w="3720" w:type="dxa"/>
+            <w:tcBorders/>
+            <w:vAlign w:val="center"/>
+          </w:tcPr>
+          <w:p>
+            <w:pPr>
+              <w:pStyle w:val="TableContents"/>
+              <w:widowControl w:val="false"/>
+              <w:suppressLineNumbers/>
+              <w:bidi w:val="0"/>
+              <w:jc w:val="start"/>
+              <w:rPr/>
+            </w:pPr>
+            <w:r>
+              <w:rPr/>
+              <w:t>“</w:t>
+            </w:r>
+            <w:r>
+              <w:rPr/>
+              <w:t>These keep the wire connections organized, labeled, and easier to repair.”</w:t>
+            </w:r>
+          </w:p>
+        </w:tc>
+      </w:tr>
+      <w:tr>
+        <w:trPr>
+          <w:cantSplit w:val="true"/>
+        </w:trPr>
+        <w:tc>
+          <w:tcPr>
+            <w:tcW w:w="1725" w:type="dxa"/>
+            <w:tcBorders/>
+            <w:vAlign w:val="center"/>
+          </w:tcPr>
+          <w:p>
+            <w:pPr>
+              <w:pStyle w:val="TableContents"/>
+              <w:widowControl w:val="false"/>
+              <w:suppressLineNumbers/>
+              <w:bidi w:val="0"/>
+              <w:jc w:val="start"/>
+              <w:rPr/>
+            </w:pPr>
+            <w:r>
+              <w:rPr>
+                <w:rStyle w:val="Strong"/>
+              </w:rPr>
+              <w:t>Cable glands and connectors</w:t>
+            </w:r>
+          </w:p>
+        </w:tc>
+        <w:tc>
+          <w:tcPr>
+            <w:tcW w:w="4755" w:type="dxa"/>
+            <w:tcBorders/>
+            <w:vAlign w:val="center"/>
+          </w:tcPr>
+          <w:p>
+            <w:pPr>
+              <w:pStyle w:val="TableContents"/>
+              <w:widowControl w:val="false"/>
+              <w:suppressLineNumbers/>
+              <w:bidi w:val="0"/>
+              <w:jc w:val="start"/>
+              <w:rPr/>
+            </w:pPr>
+            <w:r>
+              <w:rPr/>
+              <w:t>Secure cables entering the enclosure and help provide strain relief and water protection.</w:t>
+            </w:r>
+          </w:p>
+        </w:tc>
+        <w:tc>
+          <w:tcPr>
+            <w:tcW w:w="3720" w:type="dxa"/>
+            <w:tcBorders/>
+            <w:vAlign w:val="center"/>
+          </w:tcPr>
+          <w:p>
+            <w:pPr>
+              <w:pStyle w:val="TableContents"/>
+              <w:widowControl w:val="false"/>
+              <w:suppressLineNumbers/>
+              <w:bidi w:val="0"/>
+              <w:jc w:val="start"/>
+              <w:rPr/>
+            </w:pPr>
+            <w:r>
+              <w:rPr/>
+              <w:t>“</w:t>
+            </w:r>
+            <w:r>
+              <w:rPr/>
+              <w:t>These protect the cable entry points so wires are not easily pulled or exposed to water.”</w:t>
+            </w:r>
+          </w:p>
+        </w:tc>
+      </w:tr>
+      <w:tr>
+        <w:trPr>
+          <w:cantSplit w:val="true"/>
+        </w:trPr>
+        <w:tc>
+          <w:tcPr>
+            <w:tcW w:w="1725" w:type="dxa"/>
+            <w:tcBorders/>
+            <w:vAlign w:val="center"/>
+          </w:tcPr>
+          <w:p>
+            <w:pPr>
+              <w:pStyle w:val="TableContents"/>
+              <w:widowControl w:val="false"/>
+              <w:suppressLineNumbers/>
+              <w:bidi w:val="0"/>
+              <w:jc w:val="start"/>
+              <w:rPr/>
+            </w:pPr>
+            <w:r>
+              <w:rPr>
+                <w:rStyle w:val="Strong"/>
+              </w:rPr>
+              <w:t>Mooring and anchor</w:t>
+            </w:r>
+          </w:p>
+        </w:tc>
+        <w:tc>
+          <w:tcPr>
+            <w:tcW w:w="4755" w:type="dxa"/>
+            <w:tcBorders/>
+            <w:vAlign w:val="center"/>
+          </w:tcPr>
+          <w:p>
+            <w:pPr>
+              <w:pStyle w:val="TableContents"/>
+              <w:widowControl w:val="false"/>
+              <w:suppressLineNumbers/>
+              <w:bidi w:val="0"/>
+              <w:jc w:val="start"/>
+              <w:rPr/>
+            </w:pPr>
+            <w:r>
+              <w:rPr/>
+              <w:t>Hold the buoy near its approved deployment position while allowing normal movement caused by tide, current, and waves.</w:t>
+            </w:r>
+          </w:p>
+        </w:tc>
+        <w:tc>
+          <w:tcPr>
+            <w:tcW w:w="3720" w:type="dxa"/>
+            <w:tcBorders/>
+            <w:vAlign w:val="center"/>
+          </w:tcPr>
+          <w:p>
+            <w:pPr>
+              <w:pStyle w:val="TableContents"/>
+              <w:widowControl w:val="false"/>
+              <w:suppressLineNumbers/>
+              <w:bidi w:val="0"/>
+              <w:jc w:val="start"/>
+              <w:rPr/>
+            </w:pPr>
+            <w:r>
+              <w:rPr/>
+              <w:t>“</w:t>
+            </w:r>
+            <w:r>
+              <w:rPr/>
+              <w:t>The mooring keeps the buoy in its assigned area, while GPS helps us check abnormal movement.”</w:t>
+            </w:r>
+          </w:p>
+        </w:tc>
+      </w:tr>
+      <w:tr>
+        <w:trPr>
+          <w:cantSplit w:val="true"/>
+        </w:trPr>
+        <w:tc>
+          <w:tcPr>
+            <w:tcW w:w="1725" w:type="dxa"/>
+            <w:tcBorders/>
+            <w:vAlign w:val="center"/>
+          </w:tcPr>
+          <w:p>
+            <w:pPr>
+              <w:pStyle w:val="TableContents"/>
+              <w:widowControl w:val="false"/>
+              <w:suppressLineNumbers/>
+              <w:bidi w:val="0"/>
+              <w:jc w:val="start"/>
+              <w:rPr/>
+            </w:pPr>
+            <w:r>
+              <w:rPr>
+                <w:rStyle w:val="Strong"/>
+              </w:rPr>
+              <w:t>Local database</w:t>
+            </w:r>
+          </w:p>
+        </w:tc>
+        <w:tc>
+          <w:tcPr>
+            <w:tcW w:w="4755" w:type="dxa"/>
+            <w:tcBorders/>
+            <w:vAlign w:val="center"/>
+          </w:tcPr>
+          <w:p>
+            <w:pPr>
+              <w:pStyle w:val="TableContents"/>
+              <w:widowControl w:val="false"/>
+              <w:suppressLineNumbers/>
+              <w:bidi w:val="0"/>
+              <w:jc w:val="start"/>
+              <w:rPr/>
+            </w:pPr>
+            <w:r>
+              <w:rPr/>
+              <w:t>An organized record of measurements, predictions, alerts, and system events stored on the edge computer.</w:t>
+            </w:r>
+          </w:p>
+        </w:tc>
+        <w:tc>
+          <w:tcPr>
+            <w:tcW w:w="3720" w:type="dxa"/>
+            <w:tcBorders/>
+            <w:vAlign w:val="center"/>
+          </w:tcPr>
+          <w:p>
+            <w:pPr>
+              <w:pStyle w:val="TableContents"/>
+              <w:widowControl w:val="false"/>
+              <w:suppressLineNumbers/>
+              <w:bidi w:val="0"/>
+              <w:jc w:val="start"/>
+              <w:rPr/>
+            </w:pPr>
+            <w:r>
+              <w:rPr/>
+              <w:t>“</w:t>
+            </w:r>
+            <w:r>
+              <w:rPr/>
+              <w:t>The database is the digital logbook of everything the buoy records.”</w:t>
+            </w:r>
+          </w:p>
+        </w:tc>
+      </w:tr>
+      <w:tr>
+        <w:trPr>
+          <w:cantSplit w:val="true"/>
+        </w:trPr>
+        <w:tc>
+          <w:tcPr>
+            <w:tcW w:w="1725" w:type="dxa"/>
+            <w:tcBorders/>
+            <w:vAlign w:val="center"/>
+          </w:tcPr>
+          <w:p>
+            <w:pPr>
+              <w:pStyle w:val="TableContents"/>
+              <w:widowControl w:val="false"/>
+              <w:suppressLineNumbers/>
+              <w:bidi w:val="0"/>
+              <w:jc w:val="start"/>
+              <w:rPr/>
+            </w:pPr>
+            <w:r>
+              <w:rPr>
+                <w:rStyle w:val="Strong"/>
+              </w:rPr>
+              <w:t>API</w:t>
+            </w:r>
+          </w:p>
+        </w:tc>
+        <w:tc>
+          <w:tcPr>
+            <w:tcW w:w="4755" w:type="dxa"/>
+            <w:tcBorders/>
+            <w:vAlign w:val="center"/>
+          </w:tcPr>
+          <w:p>
+            <w:pPr>
+              <w:pStyle w:val="TableContents"/>
+              <w:widowControl w:val="false"/>
+              <w:suppressLineNumbers/>
+              <w:bidi w:val="0"/>
+              <w:jc w:val="start"/>
+              <w:rPr/>
+            </w:pPr>
+            <w:r>
+              <w:rPr/>
+              <w:t>A software connection that lets the dashboard request current and historical information from the edge service.</w:t>
+            </w:r>
+          </w:p>
+        </w:tc>
+        <w:tc>
+          <w:tcPr>
+            <w:tcW w:w="3720" w:type="dxa"/>
+            <w:tcBorders/>
+            <w:vAlign w:val="center"/>
+          </w:tcPr>
+          <w:p>
+            <w:pPr>
+              <w:pStyle w:val="TableContents"/>
+              <w:widowControl w:val="false"/>
+              <w:suppressLineNumbers/>
+              <w:bidi w:val="0"/>
+              <w:jc w:val="start"/>
+              <w:rPr/>
+            </w:pPr>
+            <w:r>
+              <w:rPr/>
+              <w:t>“</w:t>
+            </w:r>
+            <w:r>
+              <w:rPr/>
+              <w:t>The API is the messenger between the saved data and the dashboard.”</w:t>
+            </w:r>
+          </w:p>
+        </w:tc>
+      </w:tr>
+      <w:tr>
+        <w:trPr>
+          <w:cantSplit w:val="true"/>
+        </w:trPr>
+        <w:tc>
+          <w:tcPr>
+            <w:tcW w:w="1725" w:type="dxa"/>
+            <w:tcBorders/>
+            <w:vAlign w:val="center"/>
+          </w:tcPr>
+          <w:p>
+            <w:pPr>
+              <w:pStyle w:val="TableContents"/>
+              <w:widowControl w:val="false"/>
+              <w:suppressLineNumbers/>
+              <w:bidi w:val="0"/>
+              <w:jc w:val="start"/>
+              <w:rPr/>
+            </w:pPr>
+            <w:r>
+              <w:rPr>
+                <w:rStyle w:val="Strong"/>
+              </w:rPr>
+              <w:t>Dashboard</w:t>
+            </w:r>
+          </w:p>
+        </w:tc>
+        <w:tc>
+          <w:tcPr>
+            <w:tcW w:w="4755" w:type="dxa"/>
+            <w:tcBorders/>
+            <w:vAlign w:val="center"/>
+          </w:tcPr>
+          <w:p>
+            <w:pPr>
+              <w:pStyle w:val="TableContents"/>
+              <w:widowControl w:val="false"/>
+              <w:suppressLineNumbers/>
+              <w:bidi w:val="0"/>
+              <w:jc w:val="start"/>
+              <w:rPr/>
+            </w:pPr>
+            <w:r>
+              <w:rPr/>
+              <w:t>The human-readable interface that displays current readings, graphs, history, alerts, and system health.</w:t>
+            </w:r>
+          </w:p>
+        </w:tc>
+        <w:tc>
+          <w:tcPr>
+            <w:tcW w:w="3720" w:type="dxa"/>
+            <w:tcBorders/>
+            <w:vAlign w:val="center"/>
+          </w:tcPr>
+          <w:p>
+            <w:pPr>
+              <w:pStyle w:val="TableContents"/>
+              <w:widowControl w:val="false"/>
+              <w:suppressLineNumbers/>
+              <w:bidi w:val="0"/>
+              <w:jc w:val="start"/>
+              <w:rPr/>
+            </w:pPr>
+            <w:r>
+              <w:rPr/>
+              <w:t>“</w:t>
+            </w:r>
+            <w:r>
+              <w:rPr/>
+              <w:t>The dashboard turns technical sensor data into information that people can understand.”</w:t>
+            </w:r>
+          </w:p>
+        </w:tc>
+      </w:tr>
+    </w:tbl>
     <w:p>
       <w:pPr>
         <w:pStyle w:val="Heading3"/>
@@ -195,57 +2151,46 @@
       </w:pPr>
       <w:r>
         <w:rPr/>
-        <w:t xml:space="preserve">Slide 1 — Project FALCON </w:t>
-      </w:r>
-      <w:r>
-        <w:rPr>
-          <w:sz w:val="24"/>
-        </w:rPr>
-        <w:t>(35–45 seconds)</w:t>
-      </w:r>
-    </w:p>
-    <w:p>
-      <w:pPr>
-        <w:pStyle w:val="BodyTextcue"/>
-        <w:bidi w:val="0"/>
-        <w:rPr/>
-      </w:pPr>
-      <w:r>
-        <w:rPr/>
-        <w:t>Goal: Introduce the team, the project, and the purpose of the presentation.</w:t>
-      </w:r>
-    </w:p>
-    <w:p>
-      <w:pPr>
-        <w:pStyle w:val="BodyTextscript"/>
+        <w:t>One-Sentence System Explanation</w:t>
+      </w:r>
+    </w:p>
+    <w:p>
+      <w:pPr>
+        <w:pStyle w:val="BodyTextbox"/>
+        <w:pBdr>
+          <w:left w:val="single" w:sz="24" w:space="10" w:color="3F879E"/>
+        </w:pBdr>
+        <w:bidi w:val="0"/>
+        <w:spacing w:before="180" w:after="180"/>
+        <w:ind w:start="180" w:end="180"/>
+        <w:rPr/>
+      </w:pPr>
+      <w:r>
+        <w:rPr/>
+        <w:t>“</w:t>
+      </w:r>
+      <w:r>
+        <w:rPr/>
+        <w:t>The sensors observe the buoy and environment; the ESP32 collects their readings; the Orange Pi saves and processes the data; the solar and battery system supplies energy; and the dashboard explains the results to the user.”</w:t>
+      </w:r>
+    </w:p>
+    <w:p>
+      <w:pPr>
+        <w:pStyle w:val="Heading2"/>
+        <w:numPr>
+          <w:ilvl w:val="0"/>
+          <w:numId w:val="0"/>
+        </w:numPr>
         <w:pBdr/>
         <w:bidi w:val="0"/>
-        <w:rPr/>
-      </w:pPr>
-      <w:r>
-        <w:rPr/>
-        <w:t>“</w:t>
-      </w:r>
-      <w:r>
-        <w:rPr/>
-        <w:t>Good day, everyone. We are the Project FALCON Research Group from Fullbright College. Project FALCON is our proposed smart buoy for observing coastal conditions in one specific location. In simple terms, it is a floating device with sensors, a small computer, solar power, and a dashboard. It will collect information near the deployment site and show the data in an easier form. Today, we will explain the problem, our proposed solution, what already works in software, and what we still need to build and test.”</w:t>
-      </w:r>
-    </w:p>
-    <w:p>
-      <w:pPr>
-        <w:pStyle w:val="BodyTexttransition"/>
-        <w:bidi w:val="0"/>
-        <w:rPr/>
-      </w:pPr>
-      <w:r>
-        <w:rPr>
-          <w:rStyle w:val="Strong"/>
-        </w:rPr>
-        <w:t>Transition:</w:t>
-      </w:r>
-      <w:r>
-        <w:rPr/>
-        <w:t xml:space="preserve"> “To understand why we designed FALCON, let us first look at the monitoring gap.”</w:t>
+        <w:spacing w:before="360" w:after="140"/>
+        <w:ind w:start="360" w:end="360"/>
+        <w:jc w:val="start"/>
+        <w:rPr/>
+      </w:pPr>
+      <w:r>
+        <w:rPr/>
+        <w:t>Slide-by-Slide Script</w:t>
       </w:r>
     </w:p>
     <w:p>
@@ -263,13 +2208,13 @@
       </w:pPr>
       <w:r>
         <w:rPr/>
-        <w:t xml:space="preserve">Slide 2 — Why This Matters </w:t>
+        <w:t xml:space="preserve">Slide 1 — Project FALCON </w:t>
       </w:r>
       <w:r>
         <w:rPr>
           <w:sz w:val="24"/>
         </w:rPr>
-        <w:t>(50–60 seconds)</w:t>
+        <w:t>(35–45 seconds)</w:t>
       </w:r>
     </w:p>
     <w:p>
@@ -280,7 +2225,7 @@
       </w:pPr>
       <w:r>
         <w:rPr/>
-        <w:t>Goal: Explain the problem without criticizing PAGASA or claiming that no coastal information exists.</w:t>
+        <w:t>Goal: Introduce the team, the project, and the purpose of the presentation.</w:t>
       </w:r>
     </w:p>
     <w:p>
@@ -296,7 +2241,7 @@
       </w:r>
       <w:r>
         <w:rPr/>
-        <w:t>Why is this project needed? We already have official forecasts, and we respect them. FALCON will not replace PAGASA or any official warning system. Our concern is that a forecast for a large area may not describe the exact condition at a small near-shore site. Professional monitoring equipment can also be expensive and difficult for a school or small local organization to maintain. So our question is simple: can we build a more affordable buoy that provides useful information for one selected pilot site in Palawan?”</w:t>
+        <w:t>Good day, everyone. We are the Project FALCON Research Group from Fullbright College. Project FALCON is our proposed smart buoy for observing coastal conditions in one specific location. In simple terms, it is a floating device with sensors, a small computer, solar power, and a dashboard. It will collect information near the deployment site and show the data in an easier form. Today, we will explain the problem, our proposed solution, what already works in software, and what we still need to build and test.”</w:t>
       </w:r>
     </w:p>
     <w:p>
@@ -313,7 +2258,7 @@
       </w:r>
       <w:r>
         <w:rPr/>
-        <w:t xml:space="preserve"> “Our response to this gap is a small monitoring system that can measure, process, store, and explain data locally.”</w:t>
+        <w:t xml:space="preserve"> “To understand why we designed FALCON, let us first look at the monitoring gap.”</w:t>
       </w:r>
     </w:p>
     <w:p>
@@ -331,13 +2276,13 @@
       </w:pPr>
       <w:r>
         <w:rPr/>
-        <w:t xml:space="preserve">Slide 3 — Proposed Solution </w:t>
+        <w:t xml:space="preserve">Slide 2 — Why This Matters </w:t>
       </w:r>
       <w:r>
         <w:rPr>
           <w:sz w:val="24"/>
         </w:rPr>
-        <w:t>(55–65 seconds)</w:t>
+        <w:t>(50–60 seconds)</w:t>
       </w:r>
     </w:p>
     <w:p>
@@ -348,7 +2293,7 @@
       </w:pPr>
       <w:r>
         <w:rPr/>
-        <w:t>Point to Measure, Process Locally, Display and Alert, and Research Prediction in that order.</w:t>
+        <w:t>Goal: Explain the problem without criticizing PAGASA or claiming that no coastal information exists.</w:t>
       </w:r>
     </w:p>
     <w:p>
@@ -364,7 +2309,7 @@
       </w:r>
       <w:r>
         <w:rPr/>
-        <w:t>Our proposed solution is a smart coastal buoy with four basic jobs. First, the sensors measure movement, water pressure, wind, location, temperature, and available power. Second, the ESP32 gathers the sensor readings, while the Orange Pi saves and processes them. The Orange Pi is simply the small onboard computer of the buoy. Third, the dashboard shows the information through numbers, graphs, history, and alerts. Fourth, after collecting enough real data, we will study whether the system can estimate wave height several minutes ahead. For now, the prediction is only a simulated research demonstration and not yet a real operational forecast.”</w:t>
+        <w:t>Why is this project needed? We already have official forecasts, and we respect them. FALCON will not replace PAGASA or any official warning system. Our concern is that a forecast for a large area may not describe the exact condition at a small near-shore site. Professional monitoring equipment can also be expensive and difficult for a school or small local organization to maintain. So our question is simple: can we build a more affordable buoy that provides useful information for one selected pilot site in Palawan?”</w:t>
       </w:r>
     </w:p>
     <w:p>
@@ -381,7 +2326,7 @@
       </w:r>
       <w:r>
         <w:rPr/>
-        <w:t xml:space="preserve"> “The next image shows where these functions are located on the proposed buoy.”</w:t>
+        <w:t xml:space="preserve"> “Our response to this gap is a small monitoring system that can measure, process, store, and explain data locally.”</w:t>
       </w:r>
     </w:p>
     <w:p>
@@ -399,7 +2344,7 @@
       </w:pPr>
       <w:r>
         <w:rPr/>
-        <w:t xml:space="preserve">Slide 4 — Upper Assembly and Sensor Levels </w:t>
+        <w:t xml:space="preserve">Slide 3 — Proposed Solution </w:t>
       </w:r>
       <w:r>
         <w:rPr>
@@ -416,7 +2361,7 @@
       </w:pPr>
       <w:r>
         <w:rPr/>
-        <w:t>Point from the top sensor deck downward. Do not discuss an underwater pointed section because it is not part of the approved visual.</w:t>
+        <w:t>Point to Measure, Process Locally, Display and Alert, and Research Prediction in that order.</w:t>
       </w:r>
     </w:p>
     <w:p>
@@ -432,7 +2377,7 @@
       </w:r>
       <w:r>
         <w:rPr/>
-        <w:t>This image shows the parts above the water. At the top are the wind sensor, GPS, and antennas because they need open space to work properly. The solar panels are mounted on the tower and provide energy for the system. The large box in the middle is the upper electronics pod. Ito po ang dry and protected box where we plan to place the ESP32, Orange Pi, storage, and other electronic boards. The motion sensor is attached to a rigid part of the structure so it measures the movement of the buoy itself. The round body at the bottom is the main float that keeps the structure above water. Its final balance and waterline will still be tested using the physical prototype.”</w:t>
+        <w:t>Our proposed solution is a smart coastal buoy with four basic jobs. First, the sensors measure movement, water pressure, wind, location, temperature, and available power. Second, the ESP32 gathers the sensor readings, while the Orange Pi saves and processes them. The Orange Pi is simply the small onboard computer of the buoy. Third, the dashboard shows the information through numbers, graphs, history, and alerts. Fourth, after collecting enough real data, we will study whether the system can estimate wave height several minutes ahead. For now, the prediction is only a simulated research demonstration and not yet a real operational forecast.”</w:t>
       </w:r>
     </w:p>
     <w:p>
@@ -449,7 +2394,7 @@
       </w:r>
       <w:r>
         <w:rPr/>
-        <w:t xml:space="preserve"> “Inside that structure, the sensors and power system follow this proposed electronics plan.”</w:t>
+        <w:t xml:space="preserve"> “The next image shows where these functions are located on the proposed buoy.”</w:t>
       </w:r>
     </w:p>
     <w:p>
@@ -467,6 +2412,74 @@
       </w:pPr>
       <w:r>
         <w:rPr/>
+        <w:t xml:space="preserve">Slide 4 — Upper Assembly and Sensor Levels </w:t>
+      </w:r>
+      <w:r>
+        <w:rPr>
+          <w:sz w:val="24"/>
+        </w:rPr>
+        <w:t>(55–65 seconds)</w:t>
+      </w:r>
+    </w:p>
+    <w:p>
+      <w:pPr>
+        <w:pStyle w:val="BodyTextcue"/>
+        <w:bidi w:val="0"/>
+        <w:rPr/>
+      </w:pPr>
+      <w:r>
+        <w:rPr/>
+        <w:t>Point from the top sensor deck downward. Do not discuss an underwater pointed section because it is not part of the approved visual.</w:t>
+      </w:r>
+    </w:p>
+    <w:p>
+      <w:pPr>
+        <w:pStyle w:val="BodyTextscript"/>
+        <w:pBdr/>
+        <w:bidi w:val="0"/>
+        <w:rPr/>
+      </w:pPr>
+      <w:r>
+        <w:rPr/>
+        <w:t>“</w:t>
+      </w:r>
+      <w:r>
+        <w:rPr/>
+        <w:t>This image shows the parts above the water. At the top are the wind sensor, GPS, and antennas because they need open space to work properly. The solar panels are mounted on the tower and provide energy for the system. The large box in the middle is the upper electronics pod. Ito po ang dry and protected box where we plan to place the ESP32, Orange Pi, storage, and other electronic boards. The motion sensor is attached to a rigid part of the structure so it measures the movement of the buoy itself. The round body at the bottom is the main float that keeps the structure above water. Its final balance and waterline will still be tested using the physical prototype.”</w:t>
+      </w:r>
+    </w:p>
+    <w:p>
+      <w:pPr>
+        <w:pStyle w:val="BodyTexttransition"/>
+        <w:bidi w:val="0"/>
+        <w:rPr/>
+      </w:pPr>
+      <w:r>
+        <w:rPr>
+          <w:rStyle w:val="Strong"/>
+        </w:rPr>
+        <w:t>Transition:</w:t>
+      </w:r>
+      <w:r>
+        <w:rPr/>
+        <w:t xml:space="preserve"> “Inside that structure, the sensors and power system follow this proposed electronics plan.”</w:t>
+      </w:r>
+    </w:p>
+    <w:p>
+      <w:pPr>
+        <w:pStyle w:val="Heading3"/>
+        <w:numPr>
+          <w:ilvl w:val="0"/>
+          <w:numId w:val="0"/>
+        </w:numPr>
+        <w:bidi w:val="0"/>
+        <w:spacing w:before="280" w:after="100"/>
+        <w:ind w:start="280" w:end="280"/>
+        <w:jc w:val="start"/>
+        <w:rPr/>
+      </w:pPr>
+      <w:r>
+        <w:rPr/>
         <w:t xml:space="preserve">Slide 5 — Hardware Concept </w:t>
       </w:r>
       <w:r>
@@ -500,7 +2513,7 @@
       </w:r>
       <w:r>
         <w:rPr/>
-        <w:t>This diagram explains the job of each electronic component. The BNO085 measures the tilt and movement of the buoy. The Bar02 measures water pressure, which may help us estimate wave movement after proper calibration. GPS tells us the location, while the wind sensor measures wind speed and direction. The INA260 boards check the battery and solar power, and the MCP9808 checks the temperature inside the electronics box. All sensor readings go first to the ESP32. The ESP32 then sends the data to the Orange Pi for storage, processing, and display on the dashboard. The lower section shows how solar energy charges the battery and safely supplies power to the electronics. This is still a design guide; we will confirm the exact wiring using the real boards and their official datasheets.”</w:t>
+        <w:t>To make this diagram easier, we can divide the components into four groups. The first group is sensing: BNO085 measures buoy movement, Bar02 measures water pressure, GPS gives location, and the weather sensor measures wind. The second group is control: the ESP32 collects all sensor readings, while the Orange Pi saves, processes, and sends the results to the dashboard. The third group is system health: INA260 boards act as power meters for the battery and solar branches, while MCP9808 checks if the electronics box becomes too hot. The fourth group is power: solar panels produce energy, the MPPT controls battery charging, the battery stores energy, and buck converters provide the safe voltage required by the computers. The fuse and disconnect protect the system and allow safe maintenance. So the simple flow is: sensors measure, ESP32 collects, Orange Pi explains, and the power system keeps everything running. This remains a design guide until we confirm the real components, wiring, and safety calculations.”</w:t>
       </w:r>
     </w:p>
     <w:p>
@@ -1084,7 +3097,9 @@
         <w:gridCol w:w="7454"/>
       </w:tblGrid>
       <w:tr>
-        <w:trPr/>
+        <w:trPr>
+          <w:cantSplit w:val="true"/>
+        </w:trPr>
         <w:tc>
           <w:tcPr>
             <w:tcW w:w="2746" w:type="dxa"/>
@@ -1096,7 +3111,6 @@
               <w:pStyle w:val="TableHeading"/>
               <w:suppressLineNumbers/>
               <w:bidi w:val="0"/>
-              <w:spacing w:before="0" w:after="140"/>
               <w:jc w:val="center"/>
               <w:rPr/>
             </w:pPr>
@@ -1117,7 +3131,6 @@
               <w:pStyle w:val="TableHeading"/>
               <w:suppressLineNumbers/>
               <w:bidi w:val="0"/>
-              <w:spacing w:before="0" w:after="140"/>
               <w:jc w:val="center"/>
               <w:rPr/>
             </w:pPr>
@@ -1129,7 +3142,9 @@
         </w:tc>
       </w:tr>
       <w:tr>
-        <w:trPr/>
+        <w:trPr>
+          <w:cantSplit w:val="true"/>
+        </w:trPr>
         <w:tc>
           <w:tcPr>
             <w:tcW w:w="2746" w:type="dxa"/>
@@ -1139,8 +3154,10 @@
           <w:p>
             <w:pPr>
               <w:pStyle w:val="TableContents"/>
-              <w:bidi w:val="0"/>
-              <w:spacing w:before="0" w:after="140"/>
+              <w:widowControl w:val="false"/>
+              <w:suppressLineNumbers/>
+              <w:bidi w:val="0"/>
+              <w:jc w:val="start"/>
               <w:rPr/>
             </w:pPr>
             <w:r>
@@ -1158,8 +3175,10 @@
           <w:p>
             <w:pPr>
               <w:pStyle w:val="TableContents"/>
-              <w:bidi w:val="0"/>
-              <w:spacing w:before="0" w:after="140"/>
+              <w:widowControl w:val="false"/>
+              <w:suppressLineNumbers/>
+              <w:bidi w:val="0"/>
+              <w:jc w:val="start"/>
               <w:rPr/>
             </w:pPr>
             <w:r>
@@ -1174,7 +3193,9 @@
         </w:tc>
       </w:tr>
       <w:tr>
-        <w:trPr/>
+        <w:trPr>
+          <w:cantSplit w:val="true"/>
+        </w:trPr>
         <w:tc>
           <w:tcPr>
             <w:tcW w:w="2746" w:type="dxa"/>
@@ -1184,8 +3205,10 @@
           <w:p>
             <w:pPr>
               <w:pStyle w:val="TableContents"/>
-              <w:bidi w:val="0"/>
-              <w:spacing w:before="0" w:after="140"/>
+              <w:widowControl w:val="false"/>
+              <w:suppressLineNumbers/>
+              <w:bidi w:val="0"/>
+              <w:jc w:val="start"/>
               <w:rPr/>
             </w:pPr>
             <w:r>
@@ -1203,8 +3226,10 @@
           <w:p>
             <w:pPr>
               <w:pStyle w:val="TableContents"/>
-              <w:bidi w:val="0"/>
-              <w:spacing w:before="0" w:after="140"/>
+              <w:widowControl w:val="false"/>
+              <w:suppressLineNumbers/>
+              <w:bidi w:val="0"/>
+              <w:jc w:val="start"/>
               <w:rPr/>
             </w:pPr>
             <w:r>
@@ -1219,7 +3244,9 @@
         </w:tc>
       </w:tr>
       <w:tr>
-        <w:trPr/>
+        <w:trPr>
+          <w:cantSplit w:val="true"/>
+        </w:trPr>
         <w:tc>
           <w:tcPr>
             <w:tcW w:w="2746" w:type="dxa"/>
@@ -1229,8 +3256,10 @@
           <w:p>
             <w:pPr>
               <w:pStyle w:val="TableContents"/>
-              <w:bidi w:val="0"/>
-              <w:spacing w:before="0" w:after="140"/>
+              <w:widowControl w:val="false"/>
+              <w:suppressLineNumbers/>
+              <w:bidi w:val="0"/>
+              <w:jc w:val="start"/>
               <w:rPr/>
             </w:pPr>
             <w:r>
@@ -1248,8 +3277,10 @@
           <w:p>
             <w:pPr>
               <w:pStyle w:val="TableContents"/>
-              <w:bidi w:val="0"/>
-              <w:spacing w:before="0" w:after="140"/>
+              <w:widowControl w:val="false"/>
+              <w:suppressLineNumbers/>
+              <w:bidi w:val="0"/>
+              <w:jc w:val="start"/>
               <w:rPr/>
             </w:pPr>
             <w:r>
@@ -1264,7 +3295,9 @@
         </w:tc>
       </w:tr>
       <w:tr>
-        <w:trPr/>
+        <w:trPr>
+          <w:cantSplit w:val="true"/>
+        </w:trPr>
         <w:tc>
           <w:tcPr>
             <w:tcW w:w="2746" w:type="dxa"/>
@@ -1274,8 +3307,10 @@
           <w:p>
             <w:pPr>
               <w:pStyle w:val="TableContents"/>
-              <w:bidi w:val="0"/>
-              <w:spacing w:before="0" w:after="140"/>
+              <w:widowControl w:val="false"/>
+              <w:suppressLineNumbers/>
+              <w:bidi w:val="0"/>
+              <w:jc w:val="start"/>
               <w:rPr/>
             </w:pPr>
             <w:r>
@@ -1293,8 +3328,10 @@
           <w:p>
             <w:pPr>
               <w:pStyle w:val="TableContents"/>
-              <w:bidi w:val="0"/>
-              <w:spacing w:before="0" w:after="140"/>
+              <w:widowControl w:val="false"/>
+              <w:suppressLineNumbers/>
+              <w:bidi w:val="0"/>
+              <w:jc w:val="start"/>
               <w:rPr/>
             </w:pPr>
             <w:r>
@@ -1309,7 +3346,9 @@
         </w:tc>
       </w:tr>
       <w:tr>
-        <w:trPr/>
+        <w:trPr>
+          <w:cantSplit w:val="true"/>
+        </w:trPr>
         <w:tc>
           <w:tcPr>
             <w:tcW w:w="2746" w:type="dxa"/>
@@ -1319,8 +3358,10 @@
           <w:p>
             <w:pPr>
               <w:pStyle w:val="TableContents"/>
-              <w:bidi w:val="0"/>
-              <w:spacing w:before="0" w:after="140"/>
+              <w:widowControl w:val="false"/>
+              <w:suppressLineNumbers/>
+              <w:bidi w:val="0"/>
+              <w:jc w:val="start"/>
               <w:rPr/>
             </w:pPr>
             <w:r>
@@ -1338,8 +3379,10 @@
           <w:p>
             <w:pPr>
               <w:pStyle w:val="TableContents"/>
-              <w:bidi w:val="0"/>
-              <w:spacing w:before="0" w:after="140"/>
+              <w:widowControl w:val="false"/>
+              <w:suppressLineNumbers/>
+              <w:bidi w:val="0"/>
+              <w:jc w:val="start"/>
               <w:rPr/>
             </w:pPr>
             <w:r>
@@ -1354,7 +3397,9 @@
         </w:tc>
       </w:tr>
       <w:tr>
-        <w:trPr/>
+        <w:trPr>
+          <w:cantSplit w:val="true"/>
+        </w:trPr>
         <w:tc>
           <w:tcPr>
             <w:tcW w:w="2746" w:type="dxa"/>
@@ -1364,8 +3409,10 @@
           <w:p>
             <w:pPr>
               <w:pStyle w:val="TableContents"/>
-              <w:bidi w:val="0"/>
-              <w:spacing w:before="0" w:after="140"/>
+              <w:widowControl w:val="false"/>
+              <w:suppressLineNumbers/>
+              <w:bidi w:val="0"/>
+              <w:jc w:val="start"/>
               <w:rPr/>
             </w:pPr>
             <w:r>
@@ -1383,8 +3430,10 @@
           <w:p>
             <w:pPr>
               <w:pStyle w:val="TableContents"/>
-              <w:bidi w:val="0"/>
-              <w:spacing w:before="0" w:after="140"/>
+              <w:widowControl w:val="false"/>
+              <w:suppressLineNumbers/>
+              <w:bidi w:val="0"/>
+              <w:jc w:val="start"/>
               <w:rPr/>
             </w:pPr>
             <w:r>
@@ -1399,7 +3448,9 @@
         </w:tc>
       </w:tr>
       <w:tr>
-        <w:trPr/>
+        <w:trPr>
+          <w:cantSplit w:val="true"/>
+        </w:trPr>
         <w:tc>
           <w:tcPr>
             <w:tcW w:w="2746" w:type="dxa"/>
@@ -1409,8 +3460,10 @@
           <w:p>
             <w:pPr>
               <w:pStyle w:val="TableContents"/>
-              <w:bidi w:val="0"/>
-              <w:spacing w:before="0" w:after="140"/>
+              <w:widowControl w:val="false"/>
+              <w:suppressLineNumbers/>
+              <w:bidi w:val="0"/>
+              <w:jc w:val="start"/>
               <w:rPr/>
             </w:pPr>
             <w:r>
@@ -1428,8 +3481,10 @@
           <w:p>
             <w:pPr>
               <w:pStyle w:val="TableContents"/>
-              <w:bidi w:val="0"/>
-              <w:spacing w:before="0" w:after="140"/>
+              <w:widowControl w:val="false"/>
+              <w:suppressLineNumbers/>
+              <w:bidi w:val="0"/>
+              <w:jc w:val="start"/>
               <w:rPr/>
             </w:pPr>
             <w:r>
@@ -1444,7 +3499,9 @@
         </w:tc>
       </w:tr>
       <w:tr>
-        <w:trPr/>
+        <w:trPr>
+          <w:cantSplit w:val="true"/>
+        </w:trPr>
         <w:tc>
           <w:tcPr>
             <w:tcW w:w="2746" w:type="dxa"/>
@@ -1454,8 +3511,10 @@
           <w:p>
             <w:pPr>
               <w:pStyle w:val="TableContents"/>
-              <w:bidi w:val="0"/>
-              <w:spacing w:before="0" w:after="140"/>
+              <w:widowControl w:val="false"/>
+              <w:suppressLineNumbers/>
+              <w:bidi w:val="0"/>
+              <w:jc w:val="start"/>
               <w:rPr/>
             </w:pPr>
             <w:r>
@@ -1473,8 +3532,10 @@
           <w:p>
             <w:pPr>
               <w:pStyle w:val="TableContents"/>
-              <w:bidi w:val="0"/>
-              <w:spacing w:before="0" w:after="140"/>
+              <w:widowControl w:val="false"/>
+              <w:suppressLineNumbers/>
+              <w:bidi w:val="0"/>
+              <w:jc w:val="start"/>
               <w:rPr/>
             </w:pPr>
             <w:r>
@@ -1852,11 +3913,16 @@
     <w:next w:val="BodyText"/>
     <w:qFormat/>
     <w:pPr>
+      <w:numPr>
+        <w:ilvl w:val="0"/>
+        <w:numId w:val="0"/>
+      </w:numPr>
       <w:spacing w:before="240" w:after="80"/>
       <w:jc w:val="center"/>
+      <w:outlineLvl w:val="0"/>
     </w:pPr>
     <w:rPr>
-      <w:rFonts w:ascii="Noto Sans" w:hAnsi="Noto Sans"/>
+      <w:rFonts w:ascii="Liberation Serif" w:hAnsi="Liberation Serif" w:eastAsia="Noto Serif CJK SC" w:cs="Noto Sans Devanagari"/>
       <w:b/>
       <w:bCs/>
       <w:color w:val="123B56"/>
@@ -1934,23 +4000,6 @@
       <w:szCs w:val="24"/>
     </w:rPr>
   </w:style>
-  <w:style w:type="character" w:styleId="EndnoteCharacters">
-    <w:name w:val="Endnote Characters"/>
-    <w:qFormat/>
-    <w:rPr/>
-  </w:style>
-  <w:style w:type="character" w:styleId="FootnoteCharacters">
-    <w:name w:val="Footnote Characters"/>
-    <w:qFormat/>
-    <w:rPr/>
-  </w:style>
-  <w:style w:type="character" w:styleId="Hyperlink">
-    <w:name w:val="Hyperlink"/>
-    <w:rPr>
-      <w:color w:val="000080"/>
-      <w:u w:val="single"/>
-    </w:rPr>
-  </w:style>
   <w:style w:type="character" w:styleId="Strong">
     <w:name w:val="Strong"/>
     <w:qFormat/>
@@ -1964,43 +4013,13 @@
     <w:qFormat/>
     <w:rPr/>
   </w:style>
-  <w:style w:type="paragraph" w:styleId="HorizontalLine">
-    <w:name w:val="Horizontal Line"/>
-    <w:basedOn w:val="Normal"/>
-    <w:next w:val="BodyText"/>
-    <w:qFormat/>
-    <w:pPr>
-      <w:pBdr>
-        <w:bottom w:val="double" w:sz="2" w:space="0" w:color="808080"/>
-      </w:pBdr>
-      <w:spacing w:before="0" w:after="283"/>
-    </w:pPr>
-    <w:rPr>
-      <w:sz w:val="12"/>
-    </w:rPr>
-  </w:style>
   <w:style w:type="paragraph" w:styleId="BodyText">
     <w:name w:val="Body Text"/>
     <w:basedOn w:val="Normal"/>
     <w:pPr>
-      <w:spacing w:before="0" w:after="140"/>
+      <w:spacing w:lineRule="auto" w:line="276" w:before="0" w:after="140"/>
       <w:jc w:val="both"/>
     </w:pPr>
-    <w:rPr/>
-  </w:style>
-  <w:style w:type="paragraph" w:styleId="EnvelopeReturn">
-    <w:name w:val="Envelope Return"/>
-    <w:basedOn w:val="Normal"/>
-    <w:pPr/>
-    <w:rPr>
-      <w:i/>
-    </w:rPr>
-  </w:style>
-  <w:style w:type="paragraph" w:styleId="TableContents">
-    <w:name w:val="Table Contents"/>
-    <w:basedOn w:val="BodyText"/>
-    <w:qFormat/>
-    <w:pPr/>
     <w:rPr/>
   </w:style>
   <w:style w:type="paragraph" w:styleId="Heading">
@@ -2013,9 +4032,45 @@
       <w:spacing w:before="240" w:after="283"/>
     </w:pPr>
     <w:rPr>
-      <w:rFonts w:ascii="Liberation Sans" w:hAnsi="Liberation Sans"/>
+      <w:rFonts w:ascii="Liberation Sans" w:hAnsi="Liberation Sans" w:eastAsia="Noto Sans CJK SC" w:cs="Noto Sans Devanagari"/>
       <w:sz w:val="28"/>
       <w:szCs w:val="28"/>
+    </w:rPr>
+  </w:style>
+  <w:style w:type="paragraph" w:styleId="BodyTextbox">
+    <w:name w:val="Body Text.box"/>
+    <w:basedOn w:val="BodyText"/>
+    <w:qFormat/>
+    <w:pPr>
+      <w:pBdr>
+        <w:left w:val="single" w:sz="24" w:space="10" w:color="3F879E"/>
+      </w:pBdr>
+      <w:spacing w:before="180" w:after="180"/>
+      <w:ind w:start="180" w:end="180"/>
+    </w:pPr>
+    <w:rPr/>
+  </w:style>
+  <w:style w:type="paragraph" w:styleId="TableContents">
+    <w:name w:val="Table Contents"/>
+    <w:basedOn w:val="Normal"/>
+    <w:qFormat/>
+    <w:pPr>
+      <w:widowControl w:val="false"/>
+      <w:suppressLineNumbers/>
+    </w:pPr>
+    <w:rPr/>
+  </w:style>
+  <w:style w:type="paragraph" w:styleId="TableHeading">
+    <w:name w:val="Table Heading"/>
+    <w:basedOn w:val="TableContents"/>
+    <w:qFormat/>
+    <w:pPr>
+      <w:suppressLineNumbers/>
+      <w:jc w:val="center"/>
+    </w:pPr>
+    <w:rPr>
+      <w:b/>
+      <w:bCs/>
     </w:rPr>
   </w:style>
   <w:style w:type="paragraph" w:styleId="BodyTextcue">
@@ -2051,32 +4106,6 @@
     <w:rPr>
       <w:color w:val="7B4D1D"/>
     </w:rPr>
-  </w:style>
-  <w:style w:type="paragraph" w:styleId="TableHeading">
-    <w:name w:val="Table Heading"/>
-    <w:basedOn w:val="TableContents"/>
-    <w:qFormat/>
-    <w:pPr>
-      <w:suppressLineNumbers/>
-      <w:jc w:val="center"/>
-    </w:pPr>
-    <w:rPr>
-      <w:b/>
-      <w:bCs/>
-    </w:rPr>
-  </w:style>
-  <w:style w:type="paragraph" w:styleId="BodyTextbox">
-    <w:name w:val="Body Text.box"/>
-    <w:basedOn w:val="BodyText"/>
-    <w:qFormat/>
-    <w:pPr>
-      <w:pBdr>
-        <w:left w:val="single" w:sz="24" w:space="10" w:color="3F879E"/>
-      </w:pBdr>
-      <w:spacing w:before="180" w:after="180"/>
-      <w:ind w:start="180" w:end="180"/>
-    </w:pPr>
-    <w:rPr/>
   </w:style>
 </w:styles>
 </file>

</xml_diff>